<commit_message>
fix: polish final thesis defense package
</commit_message>
<xml_diff>
--- a/Document/outputs/final-defense/G6519692_Zaw_Ye_Htut_Ko_Defense_Preparation_Guide.docx
+++ b/Document/outputs/final-defense/G6519692_Zaw_Ye_Htut_Ko_Defense_Preparation_Guide.docx
@@ -4075,13 +4075,9 @@
       </w:r>
     </w:p>
     <w:p>
-      <w:r>
-        <w:br w:type="page"/>
-      </w:r>
-    </w:p>
-    <w:p>
       <w:pPr>
         <w:pStyle w:val="Heading2"/>
+        <w:keepNext/>
       </w:pPr>
       <w:r>
         <w:t>Chair and Contribution</w:t>
@@ -4090,6 +4086,7 @@
     <w:p>
       <w:pPr>
         <w:pStyle w:val="Heading3"/>
+        <w:keepNext/>
       </w:pPr>
       <w:r>
         <w:t>Question 1: What is the main original contribution of this thesis?</w:t>
@@ -4097,6 +4094,8 @@
     </w:p>
     <w:p>
       <w:pPr>
+        <w:keepNext/>
+        <w:keepLines/>
         <w:spacing w:after="80"/>
       </w:pPr>
       <w:r>
@@ -4112,6 +4111,8 @@
     </w:p>
     <w:p>
       <w:pPr>
+        <w:keepNext/>
+        <w:keepLines/>
         <w:spacing w:after="80"/>
       </w:pPr>
       <w:r>
@@ -4127,6 +4128,8 @@
     </w:p>
     <w:p>
       <w:pPr>
+        <w:keepNext/>
+        <w:keepLines/>
         <w:spacing w:after="80"/>
       </w:pPr>
       <w:r>
@@ -4142,6 +4145,7 @@
     </w:p>
     <w:p>
       <w:pPr>
+        <w:keepLines/>
         <w:spacing w:after="80"/>
       </w:pPr>
       <w:r>
@@ -4158,6 +4162,7 @@
     <w:p>
       <w:pPr>
         <w:pStyle w:val="Heading3"/>
+        <w:keepNext/>
       </w:pPr>
       <w:r>
         <w:t>Question 2: Why is this research important to software engineering?</w:t>
@@ -4165,6 +4170,8 @@
     </w:p>
     <w:p>
       <w:pPr>
+        <w:keepNext/>
+        <w:keepLines/>
         <w:spacing w:after="80"/>
       </w:pPr>
       <w:r>
@@ -4180,6 +4187,8 @@
     </w:p>
     <w:p>
       <w:pPr>
+        <w:keepNext/>
+        <w:keepLines/>
         <w:spacing w:after="80"/>
       </w:pPr>
       <w:r>
@@ -4195,6 +4204,8 @@
     </w:p>
     <w:p>
       <w:pPr>
+        <w:keepNext/>
+        <w:keepLines/>
         <w:spacing w:after="80"/>
       </w:pPr>
       <w:r>
@@ -4210,6 +4221,7 @@
     </w:p>
     <w:p>
       <w:pPr>
+        <w:keepLines/>
         <w:spacing w:after="80"/>
       </w:pPr>
       <w:r>
@@ -4226,6 +4238,7 @@
     <w:p>
       <w:pPr>
         <w:pStyle w:val="Heading3"/>
+        <w:keepNext/>
       </w:pPr>
       <w:r>
         <w:t>Question 3: What is the single most important finding?</w:t>
@@ -4233,6 +4246,8 @@
     </w:p>
     <w:p>
       <w:pPr>
+        <w:keepNext/>
+        <w:keepLines/>
         <w:spacing w:after="80"/>
       </w:pPr>
       <w:r>
@@ -4248,6 +4263,8 @@
     </w:p>
     <w:p>
       <w:pPr>
+        <w:keepNext/>
+        <w:keepLines/>
         <w:spacing w:after="80"/>
       </w:pPr>
       <w:r>
@@ -4263,6 +4280,8 @@
     </w:p>
     <w:p>
       <w:pPr>
+        <w:keepNext/>
+        <w:keepLines/>
         <w:spacing w:after="80"/>
       </w:pPr>
       <w:r>
@@ -4278,6 +4297,7 @@
     </w:p>
     <w:p>
       <w:pPr>
+        <w:keepLines/>
         <w:spacing w:after="80"/>
       </w:pPr>
       <w:r>
@@ -4294,6 +4314,7 @@
     <w:p>
       <w:pPr>
         <w:pStyle w:val="Heading3"/>
+        <w:keepNext/>
       </w:pPr>
       <w:r>
         <w:t>Question 4: Why did you include the GPT-5.4 versus GPT-5.5 comparison?</w:t>
@@ -4301,6 +4322,8 @@
     </w:p>
     <w:p>
       <w:pPr>
+        <w:keepNext/>
+        <w:keepLines/>
         <w:spacing w:after="80"/>
       </w:pPr>
       <w:r>
@@ -4316,6 +4339,8 @@
     </w:p>
     <w:p>
       <w:pPr>
+        <w:keepNext/>
+        <w:keepLines/>
         <w:spacing w:after="80"/>
       </w:pPr>
       <w:r>
@@ -4331,6 +4356,8 @@
     </w:p>
     <w:p>
       <w:pPr>
+        <w:keepNext/>
+        <w:keepLines/>
         <w:spacing w:after="80"/>
       </w:pPr>
       <w:r>
@@ -4346,6 +4373,7 @@
     </w:p>
     <w:p>
       <w:pPr>
+        <w:keepLines/>
         <w:spacing w:after="80"/>
       </w:pPr>
       <w:r>
@@ -4362,6 +4390,7 @@
     <w:p>
       <w:pPr>
         <w:pStyle w:val="Heading3"/>
+        <w:keepNext/>
       </w:pPr>
       <w:r>
         <w:t>Question 5: What would a practitioner do differently after reading this thesis?</w:t>
@@ -4369,6 +4398,8 @@
     </w:p>
     <w:p>
       <w:pPr>
+        <w:keepNext/>
+        <w:keepLines/>
         <w:spacing w:after="80"/>
       </w:pPr>
       <w:r>
@@ -4384,6 +4415,8 @@
     </w:p>
     <w:p>
       <w:pPr>
+        <w:keepNext/>
+        <w:keepLines/>
         <w:spacing w:after="80"/>
       </w:pPr>
       <w:r>
@@ -4399,6 +4432,8 @@
     </w:p>
     <w:p>
       <w:pPr>
+        <w:keepNext/>
+        <w:keepLines/>
         <w:spacing w:after="80"/>
       </w:pPr>
       <w:r>
@@ -4414,6 +4449,7 @@
     </w:p>
     <w:p>
       <w:pPr>
+        <w:keepLines/>
         <w:spacing w:after="80"/>
       </w:pPr>
       <w:r>
@@ -4430,6 +4466,7 @@
     <w:p>
       <w:pPr>
         <w:pStyle w:val="Heading3"/>
+        <w:keepNext/>
       </w:pPr>
       <w:r>
         <w:t>Question 6: Why is this thesis-level work rather than a software project report?</w:t>
@@ -4437,6 +4474,8 @@
     </w:p>
     <w:p>
       <w:pPr>
+        <w:keepNext/>
+        <w:keepLines/>
         <w:spacing w:after="80"/>
       </w:pPr>
       <w:r>
@@ -4452,6 +4491,8 @@
     </w:p>
     <w:p>
       <w:pPr>
+        <w:keepNext/>
+        <w:keepLines/>
         <w:spacing w:after="80"/>
       </w:pPr>
       <w:r>
@@ -4467,6 +4508,8 @@
     </w:p>
     <w:p>
       <w:pPr>
+        <w:keepNext/>
+        <w:keepLines/>
         <w:spacing w:after="80"/>
       </w:pPr>
       <w:r>
@@ -4482,6 +4525,7 @@
     </w:p>
     <w:p>
       <w:pPr>
+        <w:keepLines/>
         <w:spacing w:after="80"/>
       </w:pPr>
       <w:r>
@@ -4503,6 +4547,7 @@
     <w:p>
       <w:pPr>
         <w:pStyle w:val="Heading2"/>
+        <w:keepNext/>
       </w:pPr>
       <w:r>
         <w:t>Research Methodology</w:t>
@@ -4511,6 +4556,7 @@
     <w:p>
       <w:pPr>
         <w:pStyle w:val="Heading3"/>
+        <w:keepNext/>
       </w:pPr>
       <w:r>
         <w:t>Question 7: How can you attribute improvements to ChatGPT rather than normal developer work?</w:t>
@@ -4518,6 +4564,8 @@
     </w:p>
     <w:p>
       <w:pPr>
+        <w:keepNext/>
+        <w:keepLines/>
         <w:spacing w:after="80"/>
       </w:pPr>
       <w:r>
@@ -4533,6 +4581,8 @@
     </w:p>
     <w:p>
       <w:pPr>
+        <w:keepNext/>
+        <w:keepLines/>
         <w:spacing w:after="80"/>
       </w:pPr>
       <w:r>
@@ -4548,6 +4598,8 @@
     </w:p>
     <w:p>
       <w:pPr>
+        <w:keepNext/>
+        <w:keepLines/>
         <w:spacing w:after="80"/>
       </w:pPr>
       <w:r>
@@ -4563,6 +4615,7 @@
     </w:p>
     <w:p>
       <w:pPr>
+        <w:keepLines/>
         <w:spacing w:after="80"/>
       </w:pPr>
       <w:r>
@@ -4579,6 +4632,7 @@
     <w:p>
       <w:pPr>
         <w:pStyle w:val="Heading3"/>
+        <w:keepNext/>
       </w:pPr>
       <w:r>
         <w:t>Question 8: Why did you use only one codebase?</w:t>
@@ -4586,6 +4640,8 @@
     </w:p>
     <w:p>
       <w:pPr>
+        <w:keepNext/>
+        <w:keepLines/>
         <w:spacing w:after="80"/>
       </w:pPr>
       <w:r>
@@ -4601,6 +4657,8 @@
     </w:p>
     <w:p>
       <w:pPr>
+        <w:keepNext/>
+        <w:keepLines/>
         <w:spacing w:after="80"/>
       </w:pPr>
       <w:r>
@@ -4616,6 +4674,8 @@
     </w:p>
     <w:p>
       <w:pPr>
+        <w:keepNext/>
+        <w:keepLines/>
         <w:spacing w:after="80"/>
       </w:pPr>
       <w:r>
@@ -4631,6 +4691,7 @@
     </w:p>
     <w:p>
       <w:pPr>
+        <w:keepLines/>
         <w:spacing w:after="80"/>
       </w:pPr>
       <w:r>
@@ -4647,6 +4708,7 @@
     <w:p>
       <w:pPr>
         <w:pStyle w:val="Heading3"/>
+        <w:keepNext/>
       </w:pPr>
       <w:r>
         <w:t>Question 9: Why did you not repeat each model run multiple times?</w:t>
@@ -4654,6 +4716,8 @@
     </w:p>
     <w:p>
       <w:pPr>
+        <w:keepNext/>
+        <w:keepLines/>
         <w:spacing w:after="80"/>
       </w:pPr>
       <w:r>
@@ -4669,6 +4733,8 @@
     </w:p>
     <w:p>
       <w:pPr>
+        <w:keepNext/>
+        <w:keepLines/>
         <w:spacing w:after="80"/>
       </w:pPr>
       <w:r>
@@ -4684,6 +4750,8 @@
     </w:p>
     <w:p>
       <w:pPr>
+        <w:keepNext/>
+        <w:keepLines/>
         <w:spacing w:after="80"/>
       </w:pPr>
       <w:r>
@@ -4699,6 +4767,7 @@
     </w:p>
     <w:p>
       <w:pPr>
+        <w:keepLines/>
         <w:spacing w:after="80"/>
       </w:pPr>
       <w:r>
@@ -4715,6 +4784,7 @@
     <w:p>
       <w:pPr>
         <w:pStyle w:val="Heading3"/>
+        <w:keepNext/>
       </w:pPr>
       <w:r>
         <w:t>Question 10: Is a before-and-after branch comparison enough to prove causality?</w:t>
@@ -4722,6 +4792,8 @@
     </w:p>
     <w:p>
       <w:pPr>
+        <w:keepNext/>
+        <w:keepLines/>
         <w:spacing w:after="80"/>
       </w:pPr>
       <w:r>
@@ -4737,6 +4809,8 @@
     </w:p>
     <w:p>
       <w:pPr>
+        <w:keepNext/>
+        <w:keepLines/>
         <w:spacing w:after="80"/>
       </w:pPr>
       <w:r>
@@ -4752,6 +4826,8 @@
     </w:p>
     <w:p>
       <w:pPr>
+        <w:keepNext/>
+        <w:keepLines/>
         <w:spacing w:after="80"/>
       </w:pPr>
       <w:r>
@@ -4767,6 +4843,7 @@
     </w:p>
     <w:p>
       <w:pPr>
+        <w:keepLines/>
         <w:spacing w:after="80"/>
       </w:pPr>
       <w:r>
@@ -4783,6 +4860,7 @@
     <w:p>
       <w:pPr>
         <w:pStyle w:val="Heading3"/>
+        <w:keepNext/>
       </w:pPr>
       <w:r>
         <w:t>Question 11: How did you prevent cherry-picking successful recommendations?</w:t>
@@ -4790,6 +4868,8 @@
     </w:p>
     <w:p>
       <w:pPr>
+        <w:keepNext/>
+        <w:keepLines/>
         <w:spacing w:after="80"/>
       </w:pPr>
       <w:r>
@@ -4805,6 +4885,8 @@
     </w:p>
     <w:p>
       <w:pPr>
+        <w:keepNext/>
+        <w:keepLines/>
         <w:spacing w:after="80"/>
       </w:pPr>
       <w:r>
@@ -4820,6 +4902,8 @@
     </w:p>
     <w:p>
       <w:pPr>
+        <w:keepNext/>
+        <w:keepLines/>
         <w:spacing w:after="80"/>
       </w:pPr>
       <w:r>
@@ -4835,6 +4919,7 @@
     </w:p>
     <w:p>
       <w:pPr>
+        <w:keepLines/>
         <w:spacing w:after="80"/>
       </w:pPr>
       <w:r>
@@ -4851,6 +4936,7 @@
     <w:p>
       <w:pPr>
         <w:pStyle w:val="Heading3"/>
+        <w:keepNext/>
       </w:pPr>
       <w:r>
         <w:t>Question 12: Why are there different baseline finding counts, 28 retained findings and 21 code smells?</w:t>
@@ -4858,6 +4944,8 @@
     </w:p>
     <w:p>
       <w:pPr>
+        <w:keepNext/>
+        <w:keepLines/>
         <w:spacing w:after="80"/>
       </w:pPr>
       <w:r>
@@ -4873,6 +4961,8 @@
     </w:p>
     <w:p>
       <w:pPr>
+        <w:keepNext/>
+        <w:keepLines/>
         <w:spacing w:after="80"/>
       </w:pPr>
       <w:r>
@@ -4888,6 +4978,8 @@
     </w:p>
     <w:p>
       <w:pPr>
+        <w:keepNext/>
+        <w:keepLines/>
         <w:spacing w:after="80"/>
       </w:pPr>
       <w:r>
@@ -4903,6 +4995,7 @@
     </w:p>
     <w:p>
       <w:pPr>
+        <w:keepLines/>
         <w:spacing w:after="80"/>
       </w:pPr>
       <w:r>
@@ -4924,6 +5017,7 @@
     <w:p>
       <w:pPr>
         <w:pStyle w:val="Heading2"/>
+        <w:keepNext/>
       </w:pPr>
       <w:r>
         <w:t>Security</w:t>
@@ -4932,6 +5026,7 @@
     <w:p>
       <w:pPr>
         <w:pStyle w:val="Heading3"/>
+        <w:keepNext/>
       </w:pPr>
       <w:r>
         <w:t>Question 13: Can you claim the API is secure because ZAP has no High, Medium, or Low business alerts?</w:t>
@@ -4939,6 +5034,8 @@
     </w:p>
     <w:p>
       <w:pPr>
+        <w:keepNext/>
+        <w:keepLines/>
         <w:spacing w:after="80"/>
       </w:pPr>
       <w:r>
@@ -4954,6 +5051,8 @@
     </w:p>
     <w:p>
       <w:pPr>
+        <w:keepNext/>
+        <w:keepLines/>
         <w:spacing w:after="80"/>
       </w:pPr>
       <w:r>
@@ -4969,6 +5068,8 @@
     </w:p>
     <w:p>
       <w:pPr>
+        <w:keepNext/>
+        <w:keepLines/>
         <w:spacing w:after="80"/>
       </w:pPr>
       <w:r>
@@ -4984,6 +5085,7 @@
     </w:p>
     <w:p>
       <w:pPr>
+        <w:keepLines/>
         <w:spacing w:after="80"/>
       </w:pPr>
       <w:r>
@@ -5000,6 +5102,7 @@
     <w:p>
       <w:pPr>
         <w:pStyle w:val="Heading3"/>
+        <w:keepNext/>
       </w:pPr>
       <w:r>
         <w:t>Question 14: Why did informational alerts remain after remediation?</w:t>
@@ -5007,6 +5110,8 @@
     </w:p>
     <w:p>
       <w:pPr>
+        <w:keepNext/>
+        <w:keepLines/>
         <w:spacing w:after="80"/>
       </w:pPr>
       <w:r>
@@ -5022,6 +5127,8 @@
     </w:p>
     <w:p>
       <w:pPr>
+        <w:keepNext/>
+        <w:keepLines/>
         <w:spacing w:after="80"/>
       </w:pPr>
       <w:r>
@@ -5037,6 +5144,8 @@
     </w:p>
     <w:p>
       <w:pPr>
+        <w:keepNext/>
+        <w:keepLines/>
         <w:spacing w:after="80"/>
       </w:pPr>
       <w:r>
@@ -5052,6 +5161,7 @@
     </w:p>
     <w:p>
       <w:pPr>
+        <w:keepLines/>
         <w:spacing w:after="80"/>
       </w:pPr>
       <w:r>
@@ -5068,6 +5178,7 @@
     <w:p>
       <w:pPr>
         <w:pStyle w:val="Heading3"/>
+        <w:keepNext/>
       </w:pPr>
       <w:r>
         <w:t>Question 15: How did you test authorization?</w:t>
@@ -5075,6 +5186,8 @@
     </w:p>
     <w:p>
       <w:pPr>
+        <w:keepNext/>
+        <w:keepLines/>
         <w:spacing w:after="80"/>
       </w:pPr>
       <w:r>
@@ -5090,6 +5203,8 @@
     </w:p>
     <w:p>
       <w:pPr>
+        <w:keepNext/>
+        <w:keepLines/>
         <w:spacing w:after="80"/>
       </w:pPr>
       <w:r>
@@ -5105,6 +5220,8 @@
     </w:p>
     <w:p>
       <w:pPr>
+        <w:keepNext/>
+        <w:keepLines/>
         <w:spacing w:after="80"/>
       </w:pPr>
       <w:r>
@@ -5120,6 +5237,7 @@
     </w:p>
     <w:p>
       <w:pPr>
+        <w:keepLines/>
         <w:spacing w:after="80"/>
       </w:pPr>
       <w:r>
@@ -5136,6 +5254,7 @@
     <w:p>
       <w:pPr>
         <w:pStyle w:val="Heading3"/>
+        <w:keepNext/>
       </w:pPr>
       <w:r>
         <w:t>Question 16: What security fixes had the largest effect?</w:t>
@@ -5143,6 +5262,8 @@
     </w:p>
     <w:p>
       <w:pPr>
+        <w:keepNext/>
+        <w:keepLines/>
         <w:spacing w:after="80"/>
       </w:pPr>
       <w:r>
@@ -5158,6 +5279,8 @@
     </w:p>
     <w:p>
       <w:pPr>
+        <w:keepNext/>
+        <w:keepLines/>
         <w:spacing w:after="80"/>
       </w:pPr>
       <w:r>
@@ -5173,6 +5296,8 @@
     </w:p>
     <w:p>
       <w:pPr>
+        <w:keepNext/>
+        <w:keepLines/>
         <w:spacing w:after="80"/>
       </w:pPr>
       <w:r>
@@ -5188,6 +5313,7 @@
     </w:p>
     <w:p>
       <w:pPr>
+        <w:keepLines/>
         <w:spacing w:after="80"/>
       </w:pPr>
       <w:r>
@@ -5204,6 +5330,7 @@
     <w:p>
       <w:pPr>
         <w:pStyle w:val="Heading3"/>
+        <w:keepNext/>
       </w:pPr>
       <w:r>
         <w:t>Question 17: Did you test SQL injection and CSRF?</w:t>
@@ -5211,6 +5338,8 @@
     </w:p>
     <w:p>
       <w:pPr>
+        <w:keepNext/>
+        <w:keepLines/>
         <w:spacing w:after="80"/>
       </w:pPr>
       <w:r>
@@ -5226,6 +5355,8 @@
     </w:p>
     <w:p>
       <w:pPr>
+        <w:keepNext/>
+        <w:keepLines/>
         <w:spacing w:after="80"/>
       </w:pPr>
       <w:r>
@@ -5241,6 +5372,8 @@
     </w:p>
     <w:p>
       <w:pPr>
+        <w:keepNext/>
+        <w:keepLines/>
         <w:spacing w:after="80"/>
       </w:pPr>
       <w:r>
@@ -5256,6 +5389,7 @@
     </w:p>
     <w:p>
       <w:pPr>
+        <w:keepLines/>
         <w:spacing w:after="80"/>
       </w:pPr>
       <w:r>
@@ -5272,6 +5406,7 @@
     <w:p>
       <w:pPr>
         <w:pStyle w:val="Heading3"/>
+        <w:keepNext/>
       </w:pPr>
       <w:r>
         <w:t>Question 18: Could caching financial responses expose one user's data to another?</w:t>
@@ -5279,6 +5414,8 @@
     </w:p>
     <w:p>
       <w:pPr>
+        <w:keepNext/>
+        <w:keepLines/>
         <w:spacing w:after="80"/>
       </w:pPr>
       <w:r>
@@ -5294,6 +5431,8 @@
     </w:p>
     <w:p>
       <w:pPr>
+        <w:keepNext/>
+        <w:keepLines/>
         <w:spacing w:after="80"/>
       </w:pPr>
       <w:r>
@@ -5309,6 +5448,8 @@
     </w:p>
     <w:p>
       <w:pPr>
+        <w:keepNext/>
+        <w:keepLines/>
         <w:spacing w:after="80"/>
       </w:pPr>
       <w:r>
@@ -5324,6 +5465,7 @@
     </w:p>
     <w:p>
       <w:pPr>
+        <w:keepLines/>
         <w:spacing w:after="80"/>
       </w:pPr>
       <w:r>
@@ -5345,6 +5487,7 @@
     <w:p>
       <w:pPr>
         <w:pStyle w:val="Heading2"/>
+        <w:keepNext/>
       </w:pPr>
       <w:r>
         <w:t>Performance and Systems</w:t>
@@ -5353,6 +5496,7 @@
     <w:p>
       <w:pPr>
         <w:pStyle w:val="Heading3"/>
+        <w:keepNext/>
       </w:pPr>
       <w:r>
         <w:t>Question 19: Why focus on p95 and p99 instead of average latency?</w:t>
@@ -5360,6 +5504,8 @@
     </w:p>
     <w:p>
       <w:pPr>
+        <w:keepNext/>
+        <w:keepLines/>
         <w:spacing w:after="80"/>
       </w:pPr>
       <w:r>
@@ -5375,6 +5521,8 @@
     </w:p>
     <w:p>
       <w:pPr>
+        <w:keepNext/>
+        <w:keepLines/>
         <w:spacing w:after="80"/>
       </w:pPr>
       <w:r>
@@ -5390,6 +5538,8 @@
     </w:p>
     <w:p>
       <w:pPr>
+        <w:keepNext/>
+        <w:keepLines/>
         <w:spacing w:after="80"/>
       </w:pPr>
       <w:r>
@@ -5405,6 +5555,7 @@
     </w:p>
     <w:p>
       <w:pPr>
+        <w:keepLines/>
         <w:spacing w:after="80"/>
       </w:pPr>
       <w:r>
@@ -5421,6 +5572,7 @@
     <w:p>
       <w:pPr>
         <w:pStyle w:val="Heading3"/>
+        <w:keepNext/>
       </w:pPr>
       <w:r>
         <w:t>Question 20: Why did p500 appear faster than p100 in the baseline totals?</w:t>
@@ -5428,6 +5580,8 @@
     </w:p>
     <w:p>
       <w:pPr>
+        <w:keepNext/>
+        <w:keepLines/>
         <w:spacing w:after="80"/>
       </w:pPr>
       <w:r>
@@ -5443,6 +5597,8 @@
     </w:p>
     <w:p>
       <w:pPr>
+        <w:keepNext/>
+        <w:keepLines/>
         <w:spacing w:after="80"/>
       </w:pPr>
       <w:r>
@@ -5458,6 +5614,8 @@
     </w:p>
     <w:p>
       <w:pPr>
+        <w:keepNext/>
+        <w:keepLines/>
         <w:spacing w:after="80"/>
       </w:pPr>
       <w:r>
@@ -5473,6 +5631,7 @@
     </w:p>
     <w:p>
       <w:pPr>
+        <w:keepLines/>
         <w:spacing w:after="80"/>
       </w:pPr>
       <w:r>
@@ -5489,6 +5648,7 @@
     <w:p>
       <w:pPr>
         <w:pStyle w:val="Heading3"/>
+        <w:keepNext/>
       </w:pPr>
       <w:r>
         <w:t>Question 21: What caused the largest latency improvements?</w:t>
@@ -5496,6 +5656,8 @@
     </w:p>
     <w:p>
       <w:pPr>
+        <w:keepNext/>
+        <w:keepLines/>
         <w:spacing w:after="80"/>
       </w:pPr>
       <w:r>
@@ -5511,6 +5673,8 @@
     </w:p>
     <w:p>
       <w:pPr>
+        <w:keepNext/>
+        <w:keepLines/>
         <w:spacing w:after="80"/>
       </w:pPr>
       <w:r>
@@ -5526,6 +5690,8 @@
     </w:p>
     <w:p>
       <w:pPr>
+        <w:keepNext/>
+        <w:keepLines/>
         <w:spacing w:after="80"/>
       </w:pPr>
       <w:r>
@@ -5541,6 +5707,7 @@
     </w:p>
     <w:p>
       <w:pPr>
+        <w:keepLines/>
         <w:spacing w:after="80"/>
       </w:pPr>
       <w:r>
@@ -5557,6 +5724,7 @@
     <w:p>
       <w:pPr>
         <w:pStyle w:val="Heading3"/>
+        <w:keepNext/>
       </w:pPr>
       <w:r>
         <w:t>Question 22: Why did the original drift heuristic still fail when latency improved?</w:t>
@@ -5564,6 +5732,8 @@
     </w:p>
     <w:p>
       <w:pPr>
+        <w:keepNext/>
+        <w:keepLines/>
         <w:spacing w:after="80"/>
       </w:pPr>
       <w:r>
@@ -5579,6 +5749,8 @@
     </w:p>
     <w:p>
       <w:pPr>
+        <w:keepNext/>
+        <w:keepLines/>
         <w:spacing w:after="80"/>
       </w:pPr>
       <w:r>
@@ -5594,6 +5766,8 @@
     </w:p>
     <w:p>
       <w:pPr>
+        <w:keepNext/>
+        <w:keepLines/>
         <w:spacing w:after="80"/>
       </w:pPr>
       <w:r>
@@ -5609,6 +5783,7 @@
     </w:p>
     <w:p>
       <w:pPr>
+        <w:keepLines/>
         <w:spacing w:after="80"/>
       </w:pPr>
       <w:r>
@@ -5625,6 +5800,7 @@
     <w:p>
       <w:pPr>
         <w:pStyle w:val="Heading3"/>
+        <w:keepNext/>
       </w:pPr>
       <w:r>
         <w:t>Question 23: Were the load tests run in a production environment?</w:t>
@@ -5632,6 +5808,8 @@
     </w:p>
     <w:p>
       <w:pPr>
+        <w:keepNext/>
+        <w:keepLines/>
         <w:spacing w:after="80"/>
       </w:pPr>
       <w:r>
@@ -5647,6 +5825,8 @@
     </w:p>
     <w:p>
       <w:pPr>
+        <w:keepNext/>
+        <w:keepLines/>
         <w:spacing w:after="80"/>
       </w:pPr>
       <w:r>
@@ -5662,6 +5842,8 @@
     </w:p>
     <w:p>
       <w:pPr>
+        <w:keepNext/>
+        <w:keepLines/>
         <w:spacing w:after="80"/>
       </w:pPr>
       <w:r>
@@ -5677,6 +5859,7 @@
     </w:p>
     <w:p>
       <w:pPr>
+        <w:keepLines/>
         <w:spacing w:after="80"/>
       </w:pPr>
       <w:r>
@@ -5693,6 +5876,7 @@
     <w:p>
       <w:pPr>
         <w:pStyle w:val="Heading3"/>
+        <w:keepNext/>
       </w:pPr>
       <w:r>
         <w:t>Question 24: How do you know caching did not make the accounting data stale?</w:t>
@@ -5700,6 +5884,8 @@
     </w:p>
     <w:p>
       <w:pPr>
+        <w:keepNext/>
+        <w:keepLines/>
         <w:spacing w:after="80"/>
       </w:pPr>
       <w:r>
@@ -5715,6 +5901,8 @@
     </w:p>
     <w:p>
       <w:pPr>
+        <w:keepNext/>
+        <w:keepLines/>
         <w:spacing w:after="80"/>
       </w:pPr>
       <w:r>
@@ -5730,6 +5918,8 @@
     </w:p>
     <w:p>
       <w:pPr>
+        <w:keepNext/>
+        <w:keepLines/>
         <w:spacing w:after="80"/>
       </w:pPr>
       <w:r>
@@ -5745,6 +5935,7 @@
     </w:p>
     <w:p>
       <w:pPr>
+        <w:keepLines/>
         <w:spacing w:after="80"/>
       </w:pPr>
       <w:r>
@@ -5766,6 +5957,7 @@
     <w:p>
       <w:pPr>
         <w:pStyle w:val="Heading2"/>
+        <w:keepNext/>
       </w:pPr>
       <w:r>
         <w:t>Devil's Advocate</w:t>
@@ -5774,6 +5966,7 @@
     <w:p>
       <w:pPr>
         <w:pStyle w:val="Heading3"/>
+        <w:keepNext/>
       </w:pPr>
       <w:r>
         <w:t>Question 25: Would a competent developer have made the same fixes without ChatGPT?</w:t>
@@ -5781,6 +5974,8 @@
     </w:p>
     <w:p>
       <w:pPr>
+        <w:keepNext/>
+        <w:keepLines/>
         <w:spacing w:after="80"/>
       </w:pPr>
       <w:r>
@@ -5796,6 +5991,8 @@
     </w:p>
     <w:p>
       <w:pPr>
+        <w:keepNext/>
+        <w:keepLines/>
         <w:spacing w:after="80"/>
       </w:pPr>
       <w:r>
@@ -5811,6 +6008,8 @@
     </w:p>
     <w:p>
       <w:pPr>
+        <w:keepNext/>
+        <w:keepLines/>
         <w:spacing w:after="80"/>
       </w:pPr>
       <w:r>
@@ -5826,6 +6025,7 @@
     </w:p>
     <w:p>
       <w:pPr>
+        <w:keepLines/>
         <w:spacing w:after="80"/>
       </w:pPr>
       <w:r>
@@ -5842,6 +6042,7 @@
     <w:p>
       <w:pPr>
         <w:pStyle w:val="Heading3"/>
+        <w:keepNext/>
       </w:pPr>
       <w:r>
         <w:t>Question 26: Are you simply optimizing for the tools rather than improving the software?</w:t>
@@ -5849,6 +6050,8 @@
     </w:p>
     <w:p>
       <w:pPr>
+        <w:keepNext/>
+        <w:keepLines/>
         <w:spacing w:after="80"/>
       </w:pPr>
       <w:r>
@@ -5864,6 +6067,8 @@
     </w:p>
     <w:p>
       <w:pPr>
+        <w:keepNext/>
+        <w:keepLines/>
         <w:spacing w:after="80"/>
       </w:pPr>
       <w:r>
@@ -5879,6 +6084,8 @@
     </w:p>
     <w:p>
       <w:pPr>
+        <w:keepNext/>
+        <w:keepLines/>
         <w:spacing w:after="80"/>
       </w:pPr>
       <w:r>
@@ -5894,6 +6101,7 @@
     </w:p>
     <w:p>
       <w:pPr>
+        <w:keepLines/>
         <w:spacing w:after="80"/>
       </w:pPr>
       <w:r>
@@ -5910,6 +6118,7 @@
     <w:p>
       <w:pPr>
         <w:pStyle w:val="Heading3"/>
+        <w:keepNext/>
       </w:pPr>
       <w:r>
         <w:t>Question 27: Why should we trust model identity and provenance?</w:t>
@@ -5917,6 +6126,8 @@
     </w:p>
     <w:p>
       <w:pPr>
+        <w:keepNext/>
+        <w:keepLines/>
         <w:spacing w:after="80"/>
       </w:pPr>
       <w:r>
@@ -5932,6 +6143,8 @@
     </w:p>
     <w:p>
       <w:pPr>
+        <w:keepNext/>
+        <w:keepLines/>
         <w:spacing w:after="80"/>
       </w:pPr>
       <w:r>
@@ -5947,6 +6160,8 @@
     </w:p>
     <w:p>
       <w:pPr>
+        <w:keepNext/>
+        <w:keepLines/>
         <w:spacing w:after="80"/>
       </w:pPr>
       <w:r>
@@ -5962,6 +6177,7 @@
     </w:p>
     <w:p>
       <w:pPr>
+        <w:keepLines/>
         <w:spacing w:after="80"/>
       </w:pPr>
       <w:r>
@@ -5978,6 +6194,7 @@
     <w:p>
       <w:pPr>
         <w:pStyle w:val="Heading3"/>
+        <w:keepNext/>
       </w:pPr>
       <w:r>
         <w:t>Question 28: Why did GPT-5.5 have almost as many authenticated ZAP instances as the baseline?</w:t>
@@ -5985,6 +6202,8 @@
     </w:p>
     <w:p>
       <w:pPr>
+        <w:keepNext/>
+        <w:keepLines/>
         <w:spacing w:after="80"/>
       </w:pPr>
       <w:r>
@@ -6000,6 +6219,8 @@
     </w:p>
     <w:p>
       <w:pPr>
+        <w:keepNext/>
+        <w:keepLines/>
         <w:spacing w:after="80"/>
       </w:pPr>
       <w:r>
@@ -6015,6 +6236,8 @@
     </w:p>
     <w:p>
       <w:pPr>
+        <w:keepNext/>
+        <w:keepLines/>
         <w:spacing w:after="80"/>
       </w:pPr>
       <w:r>
@@ -6030,6 +6253,7 @@
     </w:p>
     <w:p>
       <w:pPr>
+        <w:keepLines/>
         <w:spacing w:after="80"/>
       </w:pPr>
       <w:r>
@@ -6046,6 +6270,7 @@
     <w:p>
       <w:pPr>
         <w:pStyle w:val="Heading3"/>
+        <w:keepNext/>
       </w:pPr>
       <w:r>
         <w:t>Question 29: Is the new-API v2 comparison fair if GPT-5.4 lacks a JMeter candidate?</w:t>
@@ -6053,6 +6278,8 @@
     </w:p>
     <w:p>
       <w:pPr>
+        <w:keepNext/>
+        <w:keepLines/>
         <w:spacing w:after="80"/>
       </w:pPr>
       <w:r>
@@ -6068,6 +6295,8 @@
     </w:p>
     <w:p>
       <w:pPr>
+        <w:keepNext/>
+        <w:keepLines/>
         <w:spacing w:after="80"/>
       </w:pPr>
       <w:r>
@@ -6083,6 +6312,8 @@
     </w:p>
     <w:p>
       <w:pPr>
+        <w:keepNext/>
+        <w:keepLines/>
         <w:spacing w:after="80"/>
       </w:pPr>
       <w:r>
@@ -6098,6 +6329,7 @@
     </w:p>
     <w:p>
       <w:pPr>
+        <w:keepLines/>
         <w:spacing w:after="80"/>
       </w:pPr>
       <w:r>
@@ -6114,6 +6346,7 @@
     <w:p>
       <w:pPr>
         <w:pStyle w:val="Heading3"/>
+        <w:keepNext/>
       </w:pPr>
       <w:r>
         <w:t>Question 30: What result would falsify your main conclusion?</w:t>
@@ -6121,6 +6354,8 @@
     </w:p>
     <w:p>
       <w:pPr>
+        <w:keepNext/>
+        <w:keepLines/>
         <w:spacing w:after="80"/>
       </w:pPr>
       <w:r>
@@ -6136,6 +6371,8 @@
     </w:p>
     <w:p>
       <w:pPr>
+        <w:keepNext/>
+        <w:keepLines/>
         <w:spacing w:after="80"/>
       </w:pPr>
       <w:r>
@@ -6151,6 +6388,8 @@
     </w:p>
     <w:p>
       <w:pPr>
+        <w:keepNext/>
+        <w:keepLines/>
         <w:spacing w:after="80"/>
       </w:pPr>
       <w:r>
@@ -6166,6 +6405,7 @@
     </w:p>
     <w:p>
       <w:pPr>
+        <w:keepLines/>
         <w:spacing w:after="80"/>
       </w:pPr>
       <w:r>

</xml_diff>

<commit_message>
fix: frame GPT-5.5 results as future work
</commit_message>
<xml_diff>
--- a/Document/outputs/final-defense/G6519692_Zaw_Ye_Htut_Ko_Defense_Preparation_Guide.docx
+++ b/Document/outputs/final-defense/G6519692_Zaw_Ye_Htut_Ko_Defense_Preparation_Guide.docx
@@ -176,6 +176,49 @@
         <w:spacing w:after="0"/>
       </w:pPr>
     </w:p>
+    <w:tbl>
+      <w:tblPr>
+        <w:tblW w:type="auto" w:w="0"/>
+        <w:jc w:val="center"/>
+        <w:tblLayout w:type="fixed"/>
+        <w:tblLook w:firstColumn="1" w:firstRow="1" w:lastColumn="0" w:lastRow="0" w:noHBand="0" w:noVBand="1" w:val="04A0"/>
+      </w:tblPr>
+      <w:tblGrid>
+        <w:gridCol w:w="9576"/>
+      </w:tblGrid>
+      <w:tr>
+        <w:tc>
+          <w:tcPr>
+            <w:tcW w:type="dxa" w:w="9576"/>
+            <w:shd w:val="clear" w:fill="EEF3F5"/>
+            <w:tcMar>
+              <w:top w:w="120" w:type="dxa"/>
+              <w:start w:w="150" w:type="dxa"/>
+              <w:bottom w:w="120" w:type="dxa"/>
+              <w:end w:w="150" w:type="dxa"/>
+            </w:tcMar>
+            <w:vAlign w:val="center"/>
+          </w:tcPr>
+          <w:p>
+            <w:r>
+              <w:rPr>
+                <w:b/>
+                <w:color w:val="C47B12"/>
+              </w:rPr>
+              <w:t xml:space="preserve">Scope rule: </w:t>
+            </w:r>
+            <w:r>
+              <w:t>Primary evaluated model: ChatGPT/Codex 5.4. Slides 20-21 are post-thesis future-work follow-ups and must remain separate from the core thesis conclusion.</w:t>
+            </w:r>
+          </w:p>
+        </w:tc>
+      </w:tr>
+    </w:tbl>
+    <w:p>
+      <w:pPr>
+        <w:spacing w:after="0"/>
+      </w:pPr>
+    </w:p>
     <w:p>
       <w:pPr>
         <w:pStyle w:val="ListBullet"/>
@@ -226,7 +269,7 @@
     </w:p>
     <w:p>
       <w:r>
-        <w:t>Good morning, respected chair and committee members. My name is Zaw Ye Htut Ko, student ID G6519692. Today I will present my thesis on improving a financial ASP.NET Core RESTful API using ChatGPT as a code-improvement advisor. The central idea is that the model proposes changes, but human review and repeatable tool evidence decide whether those changes are accepted.</w:t>
+        <w:t>Good morning, respected chair and committee members. My name is Zaw Ye Htut Ko, student ID G6519692. Today I will present my thesis on improving a financial ASP.NET Core RESTful API using ChatGPT/Codex 5.4 as a code-improvement advisor. The central idea is that the model proposes changes, but human review and repeatable tool evidence decide whether those changes are accepted.</w:t>
       </w:r>
     </w:p>
     <w:p>
@@ -239,7 +282,7 @@
     </w:p>
     <w:p>
       <w:r>
-        <w:t>In conclusion, the study found measurable gains across static quality, security gates, and tail latency, while also identifying limitations in drift measurement and model comparison. The strongest contribution is the controlled audit-to-fix workflow. Thank you for your attention. I welcome your questions.</w:t>
+        <w:t>In conclusion, the Codex 5.4 study found measurable gains across static quality, security gates, and tail latency, while also identifying limitations in drift measurement and external validity. The strongest contribution is the controlled Codex 5.4 audit-to-fix workflow. The later newer-model measurements are future-work follow-ups and do not change this conclusion. Thank you for your attention. I welcome your questions.</w:t>
       </w:r>
     </w:p>
     <w:p>
@@ -1476,138 +1519,6 @@
           </w:tcPr>
           <w:p>
             <w:r>
-              <w:t>Comparison</w:t>
-            </w:r>
-          </w:p>
-        </w:tc>
-        <w:tc>
-          <w:tcPr>
-            <w:tcW w:type="dxa" w:w="2448"/>
-            <w:tcMar>
-              <w:top w:w="80" w:type="dxa"/>
-              <w:start w:w="100" w:type="dxa"/>
-              <w:bottom w:w="80" w:type="dxa"/>
-              <w:end w:w="100" w:type="dxa"/>
-            </w:tcMar>
-          </w:tcPr>
-          <w:p>
-            <w:r>
-              <w:t>GPT-5.4 vs GPT-5.5: Trade-offs, Not a Universal Winner</w:t>
-            </w:r>
-          </w:p>
-        </w:tc>
-        <w:tc>
-          <w:tcPr>
-            <w:tcW w:type="dxa" w:w="2448"/>
-            <w:tcMar>
-              <w:top w:w="80" w:type="dxa"/>
-              <w:start w:w="100" w:type="dxa"/>
-              <w:bottom w:w="80" w:type="dxa"/>
-              <w:end w:w="100" w:type="dxa"/>
-            </w:tcMar>
-          </w:tcPr>
-          <w:p>
-            <w:r>
-              <w:t>100 sec</w:t>
-            </w:r>
-          </w:p>
-        </w:tc>
-      </w:tr>
-      <w:tr>
-        <w:tc>
-          <w:tcPr>
-            <w:tcW w:type="dxa" w:w="2448"/>
-            <w:tcMar>
-              <w:top w:w="80" w:type="dxa"/>
-              <w:start w:w="100" w:type="dxa"/>
-              <w:bottom w:w="80" w:type="dxa"/>
-              <w:end w:w="100" w:type="dxa"/>
-            </w:tcMar>
-          </w:tcPr>
-          <w:p>
-            <w:r>
-              <w:t>19</w:t>
-            </w:r>
-          </w:p>
-        </w:tc>
-        <w:tc>
-          <w:tcPr>
-            <w:tcW w:type="dxa" w:w="2448"/>
-            <w:tcMar>
-              <w:top w:w="80" w:type="dxa"/>
-              <w:start w:w="100" w:type="dxa"/>
-              <w:bottom w:w="80" w:type="dxa"/>
-              <w:end w:w="100" w:type="dxa"/>
-            </w:tcMar>
-          </w:tcPr>
-          <w:p>
-            <w:r>
-              <w:t>Comparison</w:t>
-            </w:r>
-          </w:p>
-        </w:tc>
-        <w:tc>
-          <w:tcPr>
-            <w:tcW w:type="dxa" w:w="2448"/>
-            <w:tcMar>
-              <w:top w:w="80" w:type="dxa"/>
-              <w:start w:w="100" w:type="dxa"/>
-              <w:bottom w:w="80" w:type="dxa"/>
-              <w:end w:w="100" w:type="dxa"/>
-            </w:tcMar>
-          </w:tcPr>
-          <w:p>
-            <w:r>
-              <w:t>New-API v2 Controlled Retest</w:t>
-            </w:r>
-          </w:p>
-        </w:tc>
-        <w:tc>
-          <w:tcPr>
-            <w:tcW w:type="dxa" w:w="2448"/>
-            <w:tcMar>
-              <w:top w:w="80" w:type="dxa"/>
-              <w:start w:w="100" w:type="dxa"/>
-              <w:bottom w:w="80" w:type="dxa"/>
-              <w:end w:w="100" w:type="dxa"/>
-            </w:tcMar>
-          </w:tcPr>
-          <w:p>
-            <w:r>
-              <w:t>100 sec</w:t>
-            </w:r>
-          </w:p>
-        </w:tc>
-      </w:tr>
-      <w:tr>
-        <w:tc>
-          <w:tcPr>
-            <w:tcW w:type="dxa" w:w="2448"/>
-            <w:tcMar>
-              <w:top w:w="80" w:type="dxa"/>
-              <w:start w:w="100" w:type="dxa"/>
-              <w:bottom w:w="80" w:type="dxa"/>
-              <w:end w:w="100" w:type="dxa"/>
-            </w:tcMar>
-          </w:tcPr>
-          <w:p>
-            <w:r>
-              <w:t>20</w:t>
-            </w:r>
-          </w:p>
-        </w:tc>
-        <w:tc>
-          <w:tcPr>
-            <w:tcW w:type="dxa" w:w="2448"/>
-            <w:tcMar>
-              <w:top w:w="80" w:type="dxa"/>
-              <w:start w:w="100" w:type="dxa"/>
-              <w:bottom w:w="80" w:type="dxa"/>
-              <w:end w:w="100" w:type="dxa"/>
-            </w:tcMar>
-          </w:tcPr>
-          <w:p>
-            <w:r>
               <w:t>Synthesis</w:t>
             </w:r>
           </w:p>
@@ -1658,7 +1569,7 @@
           </w:tcPr>
           <w:p>
             <w:r>
-              <w:t>21</w:t>
+              <w:t>19</w:t>
             </w:r>
           </w:p>
         </w:tc>
@@ -1707,6 +1618,138 @@
           <w:p>
             <w:r>
               <w:t>80 sec</w:t>
+            </w:r>
+          </w:p>
+        </w:tc>
+      </w:tr>
+      <w:tr>
+        <w:tc>
+          <w:tcPr>
+            <w:tcW w:type="dxa" w:w="2448"/>
+            <w:tcMar>
+              <w:top w:w="80" w:type="dxa"/>
+              <w:start w:w="100" w:type="dxa"/>
+              <w:bottom w:w="80" w:type="dxa"/>
+              <w:end w:w="100" w:type="dxa"/>
+            </w:tcMar>
+          </w:tcPr>
+          <w:p>
+            <w:r>
+              <w:t>20</w:t>
+            </w:r>
+          </w:p>
+        </w:tc>
+        <w:tc>
+          <w:tcPr>
+            <w:tcW w:type="dxa" w:w="2448"/>
+            <w:tcMar>
+              <w:top w:w="80" w:type="dxa"/>
+              <w:start w:w="100" w:type="dxa"/>
+              <w:bottom w:w="80" w:type="dxa"/>
+              <w:end w:w="100" w:type="dxa"/>
+            </w:tcMar>
+          </w:tcPr>
+          <w:p>
+            <w:r>
+              <w:t>Future Work</w:t>
+            </w:r>
+          </w:p>
+        </w:tc>
+        <w:tc>
+          <w:tcPr>
+            <w:tcW w:type="dxa" w:w="2448"/>
+            <w:tcMar>
+              <w:top w:w="80" w:type="dxa"/>
+              <w:start w:w="100" w:type="dxa"/>
+              <w:bottom w:w="80" w:type="dxa"/>
+              <w:end w:w="100" w:type="dxa"/>
+            </w:tcMar>
+          </w:tcPr>
+          <w:p>
+            <w:r>
+              <w:t>Future Work Follow-Up: GPT-5.4 vs GPT-5.5</w:t>
+            </w:r>
+          </w:p>
+        </w:tc>
+        <w:tc>
+          <w:tcPr>
+            <w:tcW w:type="dxa" w:w="2448"/>
+            <w:tcMar>
+              <w:top w:w="80" w:type="dxa"/>
+              <w:start w:w="100" w:type="dxa"/>
+              <w:bottom w:w="80" w:type="dxa"/>
+              <w:end w:w="100" w:type="dxa"/>
+            </w:tcMar>
+          </w:tcPr>
+          <w:p>
+            <w:r>
+              <w:t>100 sec</w:t>
+            </w:r>
+          </w:p>
+        </w:tc>
+      </w:tr>
+      <w:tr>
+        <w:tc>
+          <w:tcPr>
+            <w:tcW w:type="dxa" w:w="2448"/>
+            <w:tcMar>
+              <w:top w:w="80" w:type="dxa"/>
+              <w:start w:w="100" w:type="dxa"/>
+              <w:bottom w:w="80" w:type="dxa"/>
+              <w:end w:w="100" w:type="dxa"/>
+            </w:tcMar>
+          </w:tcPr>
+          <w:p>
+            <w:r>
+              <w:t>21</w:t>
+            </w:r>
+          </w:p>
+        </w:tc>
+        <w:tc>
+          <w:tcPr>
+            <w:tcW w:type="dxa" w:w="2448"/>
+            <w:tcMar>
+              <w:top w:w="80" w:type="dxa"/>
+              <w:start w:w="100" w:type="dxa"/>
+              <w:bottom w:w="80" w:type="dxa"/>
+              <w:end w:w="100" w:type="dxa"/>
+            </w:tcMar>
+          </w:tcPr>
+          <w:p>
+            <w:r>
+              <w:t>Future Work</w:t>
+            </w:r>
+          </w:p>
+        </w:tc>
+        <w:tc>
+          <w:tcPr>
+            <w:tcW w:type="dxa" w:w="2448"/>
+            <w:tcMar>
+              <w:top w:w="80" w:type="dxa"/>
+              <w:start w:w="100" w:type="dxa"/>
+              <w:bottom w:w="80" w:type="dxa"/>
+              <w:end w:w="100" w:type="dxa"/>
+            </w:tcMar>
+          </w:tcPr>
+          <w:p>
+            <w:r>
+              <w:t>Future Work Follow-Up: New-API v2</w:t>
+            </w:r>
+          </w:p>
+        </w:tc>
+        <w:tc>
+          <w:tcPr>
+            <w:tcW w:type="dxa" w:w="2448"/>
+            <w:tcMar>
+              <w:top w:w="80" w:type="dxa"/>
+              <w:start w:w="100" w:type="dxa"/>
+              <w:bottom w:w="80" w:type="dxa"/>
+              <w:end w:w="100" w:type="dxa"/>
+            </w:tcMar>
+          </w:tcPr>
+          <w:p>
+            <w:r>
+              <w:t>100 sec</w:t>
             </w:r>
           </w:p>
         </w:tc>
@@ -1887,7 +1930,7 @@
     </w:p>
     <w:p>
       <w:r>
-        <w:t>Good morning, and thank you for the opportunity to present my final thesis. My research investigates whether ChatGPT, used through the Codex coding environment, can help improve a financial accounting RESTful API in three measurable areas: code quality, security, and performance. The important point is that the model is not treated as an autonomous developer. It acts as an advisor. Every accepted change is reviewed by a human, isolated on a Git branch, and verified with the same tool that identified the original problem. Today I will explain the method, the measured results, the limitations, and the later GPT-5.4 versus GPT-5.5 comparison.</w:t>
+        <w:t>Good morning, and thank you for the opportunity to present my final thesis. My research evaluates ChatGPT/Codex 5.4 as an improvement advisor for a financial accounting RESTful API in three measurable areas: code quality, security, and performance. The model is not treated as an autonomous developer. Every accepted change is reviewed by a human, isolated on a Git branch, and verified with the same tool that identified the original problem. I will first present the complete Codex 5.4 thesis study. Near the end, I will show later newer-model measurements only as supplemental future-work evidence, not as part of the core thesis conclusion.</w:t>
       </w:r>
     </w:p>
     <w:p>
@@ -1975,7 +2018,7 @@
         <w:t xml:space="preserve">Key message: </w:t>
       </w:r>
       <w:r>
-        <w:t>The defense moves from problem to method, evidence, comparison, and defensible conclusion.</w:t>
+        <w:t>The defense moves from the Codex 5.4 problem and method to measured evidence, future work, and a defensible conclusion.</w:t>
       </w:r>
     </w:p>
     <w:p>
@@ -1988,7 +2031,7 @@
     </w:p>
     <w:p>
       <w:r>
-        <w:t>The presentation follows five stages. First, I will define the practical problem and research gap. Second, I will explain the branch-isolated research design and the evaluation tools. Third, I will present the measured SonarQube, OWASP ZAP, and JMeter results. Fourth, I will discuss the GPT-5.4 versus GPT-5.5 comparison and the controlled new-API retest. Finally, I will state the contributions, limitations, and conclusion. Detailed branch, endpoint, and metric evidence is available in the appendix if the committee would like to inspect it during questions.</w:t>
+        <w:t>The presentation follows five stages. First, I will define the practical problem and research gap. Second, I will explain the branch-isolated research design and evaluation tools. Third, I will present the measured SonarQube, OWASP ZAP, and JMeter results from the Codex 5.4 study. Fourth, I will state the contributions and limitations, then briefly show later newer-model measurements as future-work follow-up evidence. Finally, I will return to the Codex 5.4 thesis conclusion. Detailed evidence is available in the appendix.</w:t>
       </w:r>
     </w:p>
     <w:p>
@@ -3518,7 +3561,7 @@
         <w:t xml:space="preserve">Transition: </w:t>
       </w:r>
       <w:r>
-        <w:t>The completed report also includes a controlled comparison between GPT-5.4 and GPT-5.5.</w:t>
+        <w:t>These completed Codex 5.4 results now lead to the thesis contributions and limitations.</w:t>
       </w:r>
     </w:p>
     <w:p>
@@ -3561,7 +3604,7 @@
         <w:pStyle w:val="Heading2"/>
       </w:pPr>
       <w:r>
-        <w:t>Slide 18: GPT-5.4 vs GPT-5.5: Trade-offs, Not a Universal Winner</w:t>
+        <w:t>Slide 18: Contributions</w:t>
       </w:r>
     </w:p>
     <w:p>
@@ -3576,7 +3619,7 @@
         <w:t xml:space="preserve">Time: </w:t>
       </w:r>
       <w:r>
-        <w:t>100 seconds</w:t>
+        <w:t>75 seconds</w:t>
       </w:r>
     </w:p>
     <w:p>
@@ -3591,7 +3634,7 @@
         <w:t xml:space="preserve">Key message: </w:t>
       </w:r>
       <w:r>
-        <w:t>SonarQube is a tie, residual ZAP cleanliness favors GPT-5.4, and balanced JMeter behavior with smaller patches favors GPT-5.5.</w:t>
+        <w:t>The Codex 5.4 thesis contributes measured evidence, a reusable control workflow, and transparent limits on AI-assisted remediation.</w:t>
       </w:r>
     </w:p>
     <w:p>
@@ -3604,7 +3647,7 @@
     </w:p>
     <w:p>
       <w:r>
-        <w:t>The normalized model comparison does not support a universal winner. Both models reduced SonarQube code smells from 21 to zero and reached the same 74.3 percent coverage. GPT-5.4 produced cleaner residual ZAP output. GPT-5.5 passed the business-endpoint gate but retained more Swagger, static-asset, and local-transport observations. In JMeter, GPT-5.4 was slightly faster on selected p100, p500, and soak tail metrics, but it introduced a severe p50 tail-latency regression. GPT-5.5 produced the more balanced profile and the strongest spike p99 and throughput outcome. GPT-5.5 also used fewer source and test files in the ZAP and JMeter patches. The conclusion depends on which quality dimension is weighted most heavily.</w:t>
+        <w:t>The core Codex 5.4 thesis makes three contributions. Empirically, it provides measured before-and-after evidence across static quality, security scanning, and load testing on one production-complexity accounting API. Methodologically, it defines a reusable branch-isolated, scanner-gated workflow for accepting or rejecting model recommendations. Practically, it preserves traceability from finding to prompt, candidate patch, human decision, focused test, and rerun. The thesis does not claim a new algorithm, autonomous remediation, or a universal model ranking.</w:t>
       </w:r>
     </w:p>
     <w:p>
@@ -3619,7 +3662,7 @@
         <w:t xml:space="preserve">Transition: </w:t>
       </w:r>
       <w:r>
-        <w:t>A later controlled retest corrected an important opportunity imbalance in the new-API comparison.</w:t>
+        <w:t>The value of those contributions depends on keeping the study limitations visible.</w:t>
       </w:r>
     </w:p>
     <w:p>
@@ -3634,7 +3677,7 @@
         <w:t xml:space="preserve">Do not overclaim: </w:t>
       </w:r>
       <w:r>
-        <w:t>Never say GPT-5.5 won every tool or is universally better.</w:t>
+        <w:t>Do not describe a single-system Codex 5.4 case study as broad statistical proof.</w:t>
       </w:r>
     </w:p>
     <w:p>
@@ -3649,7 +3692,7 @@
         <w:t xml:space="preserve">Evidence: </w:t>
       </w:r>
       <w:r>
-        <w:t>Tables 4.7-4.11, pp. 59-60</w:t>
+        <w:t>Section 5.3, p. 63 | Sections 3.1.3-3.1.4, p. 37</w:t>
       </w:r>
     </w:p>
     <w:p>
@@ -3662,7 +3705,7 @@
         <w:pStyle w:val="Heading2"/>
       </w:pPr>
       <w:r>
-        <w:t>Slide 19: New-API v2 Controlled Retest</w:t>
+        <w:t>Slide 19: Limitations and Future Work</w:t>
       </w:r>
     </w:p>
     <w:p>
@@ -3677,7 +3720,7 @@
         <w:t xml:space="preserve">Time: </w:t>
       </w:r>
       <w:r>
-        <w:t>100 seconds</w:t>
+        <w:t>80 seconds</w:t>
       </w:r>
     </w:p>
     <w:p>
@@ -3692,7 +3735,7 @@
         <w:t xml:space="preserve">Key message: </w:t>
       </w:r>
       <w:r>
-        <w:t>After equalizing the correction opportunity, the measured SonarQube and ZAP outcomes are ties; JMeter remains incomplete.</w:t>
+        <w:t>The Codex 5.4 workflow is reproducible, but external validity, stochastic variance, tool limits, and drift measurement remain open.</w:t>
       </w:r>
     </w:p>
     <w:p>
@@ -3705,7 +3748,7 @@
     </w:p>
     <w:p>
       <w:r>
-        <w:t>The new-API v2 retest gave both Sonar candidates the same scan, correction, and rescan opportunity. Both reached zero measured Sonar issues, zero bugs, zero code smells, and an OK gate. GPT-5.4 had a 1.4 percentage-point coverage advantage. Both ZAP candidates reduced normalized business-alert instances from 36 to 12 with identical severity and endpoint coverage. Their full public test suites passed. However, there is no valid GPT-5.4 JMeter remediation candidate; its worktree matches the challenge baseline. Therefore, no overall three-tool winner is recorded. This is not missing decoration; it is a validity boundary that prevents an unfair comparison.</w:t>
+        <w:t>The Codex 5.4 study has important limitations. It evaluates one C# API, one database-backed financial domain, one local host, and one primary model. Repeated stochastic runs were not performed, so output variance is unknown. SonarQube, ZAP, and JMeter each have detection limits and cannot replace manual security review or production observability. The mixed-workload drift rule also confounds request composition with time-based degradation. Future work should replicate the method across systems, repeat prompts, improve the drift measurement, and compare newer models without changing the original Codex 5.4 conclusion.</w:t>
       </w:r>
     </w:p>
     <w:p>
@@ -3720,7 +3763,7 @@
         <w:t xml:space="preserve">Transition: </w:t>
       </w:r>
       <w:r>
-        <w:t>These results lead to three concrete contributions.</w:t>
+        <w:t>I will now show two later measurements as future-work follow-ups, separate from the core thesis evidence.</w:t>
       </w:r>
     </w:p>
     <w:p>
@@ -3735,7 +3778,7 @@
         <w:t xml:space="preserve">Do not overclaim: </w:t>
       </w:r>
       <w:r>
-        <w:t>Do not score the unavailable JMeter track or treat the baseline as GPT-5.4 output.</w:t>
+        <w:t>Keep the original thesis conclusion limited to the Codex 5.4 study.</w:t>
       </w:r>
     </w:p>
     <w:p>
@@ -3750,7 +3793,7 @@
         <w:t xml:space="preserve">Evidence: </w:t>
       </w:r>
       <w:r>
-        <w:t>Table 4.12 and v2 result, pp. 61-62</w:t>
+        <w:t>Camera-ready Threats to Validity | Section 5.4, p. 63</w:t>
       </w:r>
     </w:p>
     <w:p>
@@ -3763,7 +3806,7 @@
         <w:pStyle w:val="Heading2"/>
       </w:pPr>
       <w:r>
-        <w:t>Slide 20: Contributions</w:t>
+        <w:t>Slide 20: Future Work Follow-Up: GPT-5.4 vs GPT-5.5</w:t>
       </w:r>
     </w:p>
     <w:p>
@@ -3778,7 +3821,7 @@
         <w:t xml:space="preserve">Time: </w:t>
       </w:r>
       <w:r>
-        <w:t>75 seconds</w:t>
+        <w:t>100 seconds</w:t>
       </w:r>
     </w:p>
     <w:p>
@@ -3793,7 +3836,7 @@
         <w:t xml:space="preserve">Key message: </w:t>
       </w:r>
       <w:r>
-        <w:t>The thesis contributes measured evidence, a reusable control workflow, and transparent limits on AI-assisted remediation.</w:t>
+        <w:t>The later comparison is a future-work extension: SonarQube ties, residual ZAP cleanliness favors GPT-5.4, and balanced JMeter behavior favors GPT-5.5.</w:t>
       </w:r>
     </w:p>
     <w:p>
@@ -3806,7 +3849,7 @@
     </w:p>
     <w:p>
       <w:r>
-        <w:t>The thesis makes three contributions. Empirically, it provides measured before-and-after evidence across static quality, security scanning, and load testing on one production-complexity accounting API. Methodologically, it defines a reusable branch-isolated, scanner-gated workflow for accepting or rejecting LLM recommendations. Practically, it preserves traceability from finding to prompt, candidate patch, human decision, focused test, and rerun. The later model comparison adds evidence that smaller patches and balanced behavior can matter as much as winning an individual metric. The thesis does not claim a new algorithm or universal model ranking.</w:t>
+        <w:t>This slide is not part of the original camera-ready study or its primary thesis conclusion. It shows a later future-work follow-up using GPT-5.5. The normalized comparison does not support a universal winner. Both models reached zero SonarQube code smells and 74.3 percent coverage. GPT-5.4 produced cleaner residual ZAP output. GPT-5.5 produced the more balanced JMeter profile and used smaller ZAP and JMeter patches. These results demonstrate how the branch-isolated workflow can support future multi-model research; they do not change the original Codex 5.4 findings.</w:t>
       </w:r>
     </w:p>
     <w:p>
@@ -3821,7 +3864,7 @@
         <w:t xml:space="preserve">Transition: </w:t>
       </w:r>
       <w:r>
-        <w:t>The value of those contributions depends on keeping their limitations visible.</w:t>
+        <w:t>A second future-work follow-up tested a more complex API challenge, but one comparison track remains incomplete.</w:t>
       </w:r>
     </w:p>
     <w:p>
@@ -3836,7 +3879,7 @@
         <w:t xml:space="preserve">Do not overclaim: </w:t>
       </w:r>
       <w:r>
-        <w:t>Do not describe a single-system case study as broad statistical proof.</w:t>
+        <w:t>Describe GPT-5.5 only as supplemental future-work evidence, never as the primary thesis model.</w:t>
       </w:r>
     </w:p>
     <w:p>
@@ -3851,7 +3894,7 @@
         <w:t xml:space="preserve">Evidence: </w:t>
       </w:r>
       <w:r>
-        <w:t>Section 5.3, p. 63 | Sections 3.1.3-3.1.4, p. 37</w:t>
+        <w:t>Later full-report extension, Tables 4.7-4.11, pp. 59-60</w:t>
       </w:r>
     </w:p>
     <w:p>
@@ -3864,7 +3907,7 @@
         <w:pStyle w:val="Heading2"/>
       </w:pPr>
       <w:r>
-        <w:t>Slide 21: Limitations and Future Work</w:t>
+        <w:t>Slide 21: Future Work Follow-Up: New-API v2</w:t>
       </w:r>
     </w:p>
     <w:p>
@@ -3879,7 +3922,7 @@
         <w:t xml:space="preserve">Time: </w:t>
       </w:r>
       <w:r>
-        <w:t>80 seconds</w:t>
+        <w:t>100 seconds</w:t>
       </w:r>
     </w:p>
     <w:p>
@@ -3894,7 +3937,7 @@
         <w:t xml:space="preserve">Key message: </w:t>
       </w:r>
       <w:r>
-        <w:t>The workflow is reproducible, but external validity, stochastic variance, and incomplete model tracks remain open.</w:t>
+        <w:t>The later v2 follow-up ties on SonarQube and ZAP, but the GPT-5.4 JMeter track is incomplete and no overall winner is recorded.</w:t>
       </w:r>
     </w:p>
     <w:p>
@@ -3907,7 +3950,7 @@
     </w:p>
     <w:p>
       <w:r>
-        <w:t>The study has important limitations. It evaluates one C# API, one database-backed financial domain, and one local host. Repeated stochastic runs were not performed, so model-output variance is unknown. SonarQube, ZAP, and JMeter each have detection limits and cannot replace manual security review or production observability. The mixed-workload drift rule confounds the final request composition with time-based degradation. Finally, the new-API v2 JMeter comparison is incomplete because a valid GPT-5.4 remediation candidate does not exist. Future work should address each of these limitations directly rather than simply expanding the number of metrics.</w:t>
+        <w:t>This is also supplemental future-work evidence rather than a core thesis result. The v2 retest gave both Sonar candidates the same scan, correction, and rescan opportunity. Both reached zero measured Sonar issues, and both ZAP candidates ended with 12 verified alert instances. Their later public suites passed 152 and 151 tests respectively. However, no valid GPT-5.4 JMeter remediation candidate exists for this v2 track. Therefore, the follow-up records SonarQube and ZAP ties but does not declare an overall three-tool winner.</w:t>
       </w:r>
     </w:p>
     <w:p>
@@ -3922,7 +3965,7 @@
         <w:t xml:space="preserve">Transition: </w:t>
       </w:r>
       <w:r>
-        <w:t>Within those boundaries, the final answer to the research problem is clear.</w:t>
+        <w:t>I will now return to the original Codex 5.4 thesis conclusion.</w:t>
       </w:r>
     </w:p>
     <w:p>
@@ -3937,7 +3980,7 @@
         <w:t xml:space="preserve">Do not overclaim: </w:t>
       </w:r>
       <w:r>
-        <w:t>State limitations confidently; do not apologize or weaken measured findings.</w:t>
+        <w:t>Do not mix the v2 test counts or partial model comparison into the original 98-test Codex 5.4 study.</w:t>
       </w:r>
     </w:p>
     <w:p>
@@ -3952,7 +3995,7 @@
         <w:t xml:space="preserve">Evidence: </w:t>
       </w:r>
       <w:r>
-        <w:t>Section 1.6, p. 12 | Section 4.7.6-4.7.7, pp. 61-62 | Section 5.4, p. 63</w:t>
+        <w:t>Later full-report extension, Table 4.12, pp. 61-62</w:t>
       </w:r>
     </w:p>
     <w:p>
@@ -4008,7 +4051,7 @@
     </w:p>
     <w:p>
       <w:r>
-        <w:t>In conclusion, this study shows that ChatGPT or Codex can be useful as a remediation advisor when it operates inside a controlled engineering process. The original study closed retained Sonar findings, cleared gated business-endpoint ZAP alerts, and achieved large p95 latency reductions. The model comparison shows real trade-offs rather than a universal winner. Human review, focused tests, branch isolation, and independent remeasurement are what make the results defensible. The central lesson is simple: use the model to propose, but use evidence to decide. Thank you. I welcome your questions.</w:t>
+        <w:t>In conclusion, the core Codex 5.4 study shows that ChatGPT can be useful as a remediation advisor when it operates inside a controlled engineering process. The study reduced the measured SonarQube finding set from 28 to zero, cleared gated business-endpoint ZAP alerts, and achieved large p95 latency reductions while preserving the documented drift limitation. Human review, focused tests, branch isolation, and independent remeasurement make these findings defensible. The future-work slides do not change this primary conclusion. The central lesson is simple: use the model to propose, but use evidence to decide. Thank you. I welcome your questions.</w:t>
       </w:r>
     </w:p>
     <w:p>
@@ -4106,7 +4149,7 @@
         <w:t xml:space="preserve">Short answer: </w:t>
       </w:r>
       <w:r>
-        <w:t>The contribution is a branch-isolated, scanner-gated workflow that evaluates LLM-assisted remediation across code quality, security, and performance on one production-complexity financial API.</w:t>
+        <w:t>The contribution is a branch-isolated, scanner-gated workflow that evaluates Codex 5.4-assisted remediation across code quality, security, and performance on one production-complexity financial API.</w:t>
       </w:r>
     </w:p>
     <w:p>
@@ -4140,7 +4183,7 @@
         <w:t xml:space="preserve">Supporting slide: </w:t>
       </w:r>
       <w:r>
-        <w:t>S20 and A09</w:t>
+        <w:t>S18 and A09</w:t>
       </w:r>
     </w:p>
     <w:p>
@@ -4317,7 +4360,7 @@
         <w:keepNext/>
       </w:pPr>
       <w:r>
-        <w:t>Question 4: Why did you include the GPT-5.4 versus GPT-5.5 comparison?</w:t>
+        <w:t>Question 4: Why did you include GPT-5.5 results if the thesis focuses on Codex 5.4?</w:t>
       </w:r>
     </w:p>
     <w:p>
@@ -4334,7 +4377,7 @@
         <w:t xml:space="preserve">Short answer: </w:t>
       </w:r>
       <w:r>
-        <w:t>It tests whether a newer model changes remediation quality, patch size, and tool outcomes under comparable evidence workflows.</w:t>
+        <w:t>They are shown only as a post-thesis future-work follow-up demonstrating how the same workflow could compare a newer model.</w:t>
       </w:r>
     </w:p>
     <w:p>
@@ -4351,7 +4394,7 @@
         <w:t xml:space="preserve">Follow-up answer: </w:t>
       </w:r>
       <w:r>
-        <w:t>The comparison reveals trade-offs: Sonar is tied, GPT-5.4 has cleaner residual ZAP output, and GPT-5.5 is more balanced in JMeter with smaller patches. That is more informative than declaring a winner.</w:t>
+        <w:t>The later comparison reveals trade-offs, but it does not change the original Codex 5.4 research questions, camera-ready paper, or thesis conclusion. It is separated on future-work slides for that reason.</w:t>
       </w:r>
     </w:p>
     <w:p>
@@ -4368,7 +4411,7 @@
         <w:t xml:space="preserve">Supporting slide: </w:t>
       </w:r>
       <w:r>
-        <w:t>S18</w:t>
+        <w:t>S20-S21</w:t>
       </w:r>
     </w:p>
     <w:p>
@@ -4384,7 +4427,7 @@
         <w:t xml:space="preserve">Caution: </w:t>
       </w:r>
       <w:r>
-        <w:t>Do not claim the comparison is exhaustive across prompts or tasks.</w:t>
+        <w:t>Do not present GPT-5.5 as the primary evaluated thesis model.</w:t>
       </w:r>
     </w:p>
     <w:p>
@@ -4686,7 +4729,7 @@
         <w:t xml:space="preserve">Supporting slide: </w:t>
       </w:r>
       <w:r>
-        <w:t>S06 and S21</w:t>
+        <w:t>S06 and S19</w:t>
       </w:r>
     </w:p>
     <w:p>
@@ -4762,7 +4805,7 @@
         <w:t xml:space="preserve">Supporting slide: </w:t>
       </w:r>
       <w:r>
-        <w:t>S21 and A08</w:t>
+        <w:t>S19 and A08</w:t>
       </w:r>
     </w:p>
     <w:p>
@@ -5139,7 +5182,7 @@
         <w:t xml:space="preserve">Follow-up answer: </w:t>
       </w:r>
       <w:r>
-        <w:t>The report retains them for transparency. In the model comparison, these residuals are why GPT-5.4 has cleaner ZAP output than GPT-5.5 even though both pass the business-endpoint gate.</w:t>
+        <w:t>The core Codex 5.4 report retains them for transparency. In the later future-work comparison, residual cleanliness also helps explain why GPT-5.4 and GPT-5.5 should not be reduced to one winner label.</w:t>
       </w:r>
     </w:p>
     <w:p>
@@ -5156,7 +5199,7 @@
         <w:t xml:space="preserve">Supporting slide: </w:t>
       </w:r>
       <w:r>
-        <w:t>S13 and S18</w:t>
+        <w:t>S13 and S20</w:t>
       </w:r>
     </w:p>
     <w:p>
@@ -5778,7 +5821,7 @@
         <w:t xml:space="preserve">Supporting slide: </w:t>
       </w:r>
       <w:r>
-        <w:t>S15 and S21</w:t>
+        <w:t>S15 and S19</w:t>
       </w:r>
     </w:p>
     <w:p>
@@ -5986,7 +6029,7 @@
         <w:t xml:space="preserve">Short answer: </w:t>
       </w:r>
       <w:r>
-        <w:t>Possibly. The thesis does not compare developer-only productivity; it evaluates whether the AI-assisted workflow produced acceptable measured outcomes.</w:t>
+        <w:t>Possibly. The thesis does not compare developer-only productivity; it evaluates whether the Codex 5.4-assisted workflow produced acceptable measured outcomes.</w:t>
       </w:r>
     </w:p>
     <w:p>
@@ -6020,7 +6063,7 @@
         <w:t xml:space="preserve">Supporting slide: </w:t>
       </w:r>
       <w:r>
-        <w:t>S20-S21</w:t>
+        <w:t>S18-S19</w:t>
       </w:r>
     </w:p>
     <w:p>
@@ -6155,7 +6198,7 @@
         <w:t xml:space="preserve">Follow-up answer: </w:t>
       </w:r>
       <w:r>
-        <w:t>The fresh v2 measurements scan model-produced source code; the tools do not invoke an LLM during measurement. Historical GPT-5.4 process evidence is less complete and is disclosed as such.</w:t>
+        <w:t>The fresh v2 measurements scan model-produced source code; the tools do not invoke an LLM during measurement. These are future-work records and remain separate from the original Codex 5.4 study.</w:t>
       </w:r>
     </w:p>
     <w:p>
@@ -6172,7 +6215,7 @@
         <w:t xml:space="preserve">Supporting slide: </w:t>
       </w:r>
       <w:r>
-        <w:t>S18-S19 and A01</w:t>
+        <w:t>S20-S21 and A01</w:t>
       </w:r>
     </w:p>
     <w:p>
@@ -6214,7 +6257,7 @@
         <w:t xml:space="preserve">Short answer: </w:t>
       </w:r>
       <w:r>
-        <w:t>Raw instance counts include repeated informational and non-business observations; the gate is interpreted by severity, class, and endpoint, not volume alone.</w:t>
+        <w:t>This is a future-work result. Raw counts include repeated informational and non-business observations; the gate is interpreted by severity, class, and endpoint, not volume alone.</w:t>
       </w:r>
     </w:p>
     <w:p>
@@ -6231,7 +6274,7 @@
         <w:t xml:space="preserve">Follow-up answer: </w:t>
       </w:r>
       <w:r>
-        <w:t>GPT-5.5 cleared the major business security-header problems but retained more Swagger, static-asset, and local-transport residuals, so GPT-5.4 is correctly reported as cleaner on ZAP.</w:t>
+        <w:t>GPT-5.5 cleared the major business security-header problems but retained more Swagger, static-asset, and local-transport residuals, so GPT-5.4 is correctly reported as cleaner on ZAP in the follow-up.</w:t>
       </w:r>
     </w:p>
     <w:p>
@@ -6248,7 +6291,7 @@
         <w:t xml:space="preserve">Supporting slide: </w:t>
       </w:r>
       <w:r>
-        <w:t>S18 and A04</w:t>
+        <w:t>S20 and A04</w:t>
       </w:r>
     </w:p>
     <w:p>
@@ -6264,7 +6307,7 @@
         <w:t xml:space="preserve">Caution: </w:t>
       </w:r>
       <w:r>
-        <w:t>Do not use only the pass label; acknowledge the residual volume.</w:t>
+        <w:t>Do not use this follow-up result as the core thesis security conclusion.</w:t>
       </w:r>
     </w:p>
     <w:p>
@@ -6273,7 +6316,7 @@
         <w:keepNext/>
       </w:pPr>
       <w:r>
-        <w:t>Question 29: Is the new-API v2 comparison fair if GPT-5.4 lacks a JMeter candidate?</w:t>
+        <w:t>Question 29: Is the future-work new-API v2 comparison fair if GPT-5.4 lacks a JMeter candidate?</w:t>
       </w:r>
     </w:p>
     <w:p>
@@ -6307,7 +6350,7 @@
         <w:t xml:space="preserve">Follow-up answer: </w:t>
       </w:r>
       <w:r>
-        <w:t>The report explicitly marks JMeter not scored and requires a fresh GPT-5.4 remediation run before any three-tool conclusion.</w:t>
+        <w:t>The follow-up explicitly marks JMeter not scored and requires a fresh GPT-5.4 remediation run before any three-tool conclusion.</w:t>
       </w:r>
     </w:p>
     <w:p>
@@ -6324,7 +6367,7 @@
         <w:t xml:space="preserve">Supporting slide: </w:t>
       </w:r>
       <w:r>
-        <w:t>S19 and A07</w:t>
+        <w:t>S21 and A07</w:t>
       </w:r>
     </w:p>
     <w:p>
@@ -6366,7 +6409,7 @@
         <w:t xml:space="preserve">Short answer: </w:t>
       </w:r>
       <w:r>
-        <w:t>If repeated controlled runs failed to reproduce tool improvements, introduced domain regressions, or required more review effort than conventional remediation, the practical claim would weaken.</w:t>
+        <w:t>If repeated controlled Codex 5.4 runs failed to reproduce tool improvements, introduced domain regressions, or required more review effort than conventional remediation, the practical claim would weaken.</w:t>
       </w:r>
     </w:p>
     <w:p>
@@ -6383,7 +6426,7 @@
         <w:t xml:space="preserve">Follow-up answer: </w:t>
       </w:r>
       <w:r>
-        <w:t>The thesis conclusion is conditional: usefulness depends on bounded prompts, human review, independent gates, and repeatable evidence. Removing those conditions changes the claim.</w:t>
+        <w:t>The core thesis conclusion is conditional: usefulness depends on bounded prompts, human review, independent gates, and repeatable evidence. Removing those conditions changes the claim.</w:t>
       </w:r>
     </w:p>
     <w:p>
@@ -6400,7 +6443,7 @@
         <w:t xml:space="preserve">Supporting slide: </w:t>
       </w:r>
       <w:r>
-        <w:t>S21-S22</w:t>
+        <w:t>S19 and S22</w:t>
       </w:r>
     </w:p>
     <w:p>

</xml_diff>

<commit_message>
docs: finalize thesis defense evidence package
</commit_message>
<xml_diff>
--- a/Document/outputs/final-defense/G6519692_Zaw_Ye_Htut_Ko_Defense_Preparation_Guide.docx
+++ b/Document/outputs/final-defense/G6519692_Zaw_Ye_Htut_Ko_Defense_Preparation_Guide.docx
@@ -165,7 +165,7 @@
               <w:t xml:space="preserve">Your target: </w:t>
             </w:r>
             <w:r>
-              <w:t>Deliver the 22 main slides in 27-28 minutes, then use appendix slides only when a professor asks for detailed evidence.</w:t>
+              <w:t>Deliver the 25 main slides in 28-29 minutes, then use appendix slides only when a professor asks for detailed evidence.</w:t>
             </w:r>
           </w:p>
         </w:tc>
@@ -208,7 +208,7 @@
               <w:t xml:space="preserve">Scope rule: </w:t>
             </w:r>
             <w:r>
-              <w:t>Primary evaluated model: ChatGPT/Codex 5.4. Slides 20-21 are post-thesis future-work follow-ups and must remain separate from the core thesis conclusion.</w:t>
+              <w:t>Primary evaluated model: ChatGPT/Codex 5.4. Slides 23-24 are post-thesis future-work follow-ups and must remain separate from the core thesis conclusion.</w:t>
             </w:r>
           </w:p>
         </w:tc>
@@ -1469,7 +1469,7 @@
           </w:tcPr>
           <w:p>
             <w:r>
-              <w:t>Working Application Evidence</w:t>
+              <w:t>Application Evidence: Admin Dashboard</w:t>
             </w:r>
           </w:p>
         </w:tc>
@@ -1485,7 +1485,7 @@
           </w:tcPr>
           <w:p>
             <w:r>
-              <w:t>65 sec</w:t>
+              <w:t>30 sec</w:t>
             </w:r>
           </w:p>
         </w:tc>
@@ -1504,6 +1504,204 @@
           <w:p>
             <w:r>
               <w:t>18</w:t>
+            </w:r>
+          </w:p>
+        </w:tc>
+        <w:tc>
+          <w:tcPr>
+            <w:tcW w:type="dxa" w:w="2448"/>
+            <w:tcMar>
+              <w:top w:w="80" w:type="dxa"/>
+              <w:start w:w="100" w:type="dxa"/>
+              <w:bottom w:w="80" w:type="dxa"/>
+              <w:end w:w="100" w:type="dxa"/>
+            </w:tcMar>
+          </w:tcPr>
+          <w:p>
+            <w:r>
+              <w:t>Results</w:t>
+            </w:r>
+          </w:p>
+        </w:tc>
+        <w:tc>
+          <w:tcPr>
+            <w:tcW w:type="dxa" w:w="2448"/>
+            <w:tcMar>
+              <w:top w:w="80" w:type="dxa"/>
+              <w:start w:w="100" w:type="dxa"/>
+              <w:bottom w:w="80" w:type="dxa"/>
+              <w:end w:w="100" w:type="dxa"/>
+            </w:tcMar>
+          </w:tcPr>
+          <w:p>
+            <w:r>
+              <w:t>Application Evidence: Trial Balance</w:t>
+            </w:r>
+          </w:p>
+        </w:tc>
+        <w:tc>
+          <w:tcPr>
+            <w:tcW w:type="dxa" w:w="2448"/>
+            <w:tcMar>
+              <w:top w:w="80" w:type="dxa"/>
+              <w:start w:w="100" w:type="dxa"/>
+              <w:bottom w:w="80" w:type="dxa"/>
+              <w:end w:w="100" w:type="dxa"/>
+            </w:tcMar>
+          </w:tcPr>
+          <w:p>
+            <w:r>
+              <w:t>30 sec</w:t>
+            </w:r>
+          </w:p>
+        </w:tc>
+      </w:tr>
+      <w:tr>
+        <w:tc>
+          <w:tcPr>
+            <w:tcW w:type="dxa" w:w="2448"/>
+            <w:tcMar>
+              <w:top w:w="80" w:type="dxa"/>
+              <w:start w:w="100" w:type="dxa"/>
+              <w:bottom w:w="80" w:type="dxa"/>
+              <w:end w:w="100" w:type="dxa"/>
+            </w:tcMar>
+          </w:tcPr>
+          <w:p>
+            <w:r>
+              <w:t>19</w:t>
+            </w:r>
+          </w:p>
+        </w:tc>
+        <w:tc>
+          <w:tcPr>
+            <w:tcW w:type="dxa" w:w="2448"/>
+            <w:tcMar>
+              <w:top w:w="80" w:type="dxa"/>
+              <w:start w:w="100" w:type="dxa"/>
+              <w:bottom w:w="80" w:type="dxa"/>
+              <w:end w:w="100" w:type="dxa"/>
+            </w:tcMar>
+          </w:tcPr>
+          <w:p>
+            <w:r>
+              <w:t>Results</w:t>
+            </w:r>
+          </w:p>
+        </w:tc>
+        <w:tc>
+          <w:tcPr>
+            <w:tcW w:type="dxa" w:w="2448"/>
+            <w:tcMar>
+              <w:top w:w="80" w:type="dxa"/>
+              <w:start w:w="100" w:type="dxa"/>
+              <w:bottom w:w="80" w:type="dxa"/>
+              <w:end w:w="100" w:type="dxa"/>
+            </w:tcMar>
+          </w:tcPr>
+          <w:p>
+            <w:r>
+              <w:t>Application Evidence: Auditor Restrictions</w:t>
+            </w:r>
+          </w:p>
+        </w:tc>
+        <w:tc>
+          <w:tcPr>
+            <w:tcW w:type="dxa" w:w="2448"/>
+            <w:tcMar>
+              <w:top w:w="80" w:type="dxa"/>
+              <w:start w:w="100" w:type="dxa"/>
+              <w:bottom w:w="80" w:type="dxa"/>
+              <w:end w:w="100" w:type="dxa"/>
+            </w:tcMar>
+          </w:tcPr>
+          <w:p>
+            <w:r>
+              <w:t>30 sec</w:t>
+            </w:r>
+          </w:p>
+        </w:tc>
+      </w:tr>
+      <w:tr>
+        <w:tc>
+          <w:tcPr>
+            <w:tcW w:type="dxa" w:w="2448"/>
+            <w:tcMar>
+              <w:top w:w="80" w:type="dxa"/>
+              <w:start w:w="100" w:type="dxa"/>
+              <w:bottom w:w="80" w:type="dxa"/>
+              <w:end w:w="100" w:type="dxa"/>
+            </w:tcMar>
+          </w:tcPr>
+          <w:p>
+            <w:r>
+              <w:t>20</w:t>
+            </w:r>
+          </w:p>
+        </w:tc>
+        <w:tc>
+          <w:tcPr>
+            <w:tcW w:type="dxa" w:w="2448"/>
+            <w:tcMar>
+              <w:top w:w="80" w:type="dxa"/>
+              <w:start w:w="100" w:type="dxa"/>
+              <w:bottom w:w="80" w:type="dxa"/>
+              <w:end w:w="100" w:type="dxa"/>
+            </w:tcMar>
+          </w:tcPr>
+          <w:p>
+            <w:r>
+              <w:t>Results</w:t>
+            </w:r>
+          </w:p>
+        </w:tc>
+        <w:tc>
+          <w:tcPr>
+            <w:tcW w:type="dxa" w:w="2448"/>
+            <w:tcMar>
+              <w:top w:w="80" w:type="dxa"/>
+              <w:start w:w="100" w:type="dxa"/>
+              <w:bottom w:w="80" w:type="dxa"/>
+              <w:end w:w="100" w:type="dxa"/>
+            </w:tcMar>
+          </w:tcPr>
+          <w:p>
+            <w:r>
+              <w:t>Application Evidence: Balanced Journal Lines</w:t>
+            </w:r>
+          </w:p>
+        </w:tc>
+        <w:tc>
+          <w:tcPr>
+            <w:tcW w:type="dxa" w:w="2448"/>
+            <w:tcMar>
+              <w:top w:w="80" w:type="dxa"/>
+              <w:start w:w="100" w:type="dxa"/>
+              <w:bottom w:w="80" w:type="dxa"/>
+              <w:end w:w="100" w:type="dxa"/>
+            </w:tcMar>
+          </w:tcPr>
+          <w:p>
+            <w:r>
+              <w:t>30 sec</w:t>
+            </w:r>
+          </w:p>
+        </w:tc>
+      </w:tr>
+      <w:tr>
+        <w:tc>
+          <w:tcPr>
+            <w:tcW w:type="dxa" w:w="2448"/>
+            <w:tcMar>
+              <w:top w:w="80" w:type="dxa"/>
+              <w:start w:w="100" w:type="dxa"/>
+              <w:bottom w:w="80" w:type="dxa"/>
+              <w:end w:w="100" w:type="dxa"/>
+            </w:tcMar>
+          </w:tcPr>
+          <w:p>
+            <w:r>
+              <w:t>21</w:t>
             </w:r>
           </w:p>
         </w:tc>
@@ -1569,7 +1767,7 @@
           </w:tcPr>
           <w:p>
             <w:r>
-              <w:t>19</w:t>
+              <w:t>22</w:t>
             </w:r>
           </w:p>
         </w:tc>
@@ -1635,7 +1833,7 @@
           </w:tcPr>
           <w:p>
             <w:r>
-              <w:t>20</w:t>
+              <w:t>23</w:t>
             </w:r>
           </w:p>
         </w:tc>
@@ -1701,7 +1899,7 @@
           </w:tcPr>
           <w:p>
             <w:r>
-              <w:t>21</w:t>
+              <w:t>24</w:t>
             </w:r>
           </w:p>
         </w:tc>
@@ -1767,7 +1965,7 @@
           </w:tcPr>
           <w:p>
             <w:r>
-              <w:t>22</w:t>
+              <w:t>25</w:t>
             </w:r>
           </w:p>
         </w:tc>
@@ -1853,7 +2051,7 @@
               <w:t xml:space="preserve">Planned duration: </w:t>
             </w:r>
             <w:r>
-              <w:t>27 minutes 35 seconds, leaving time for pauses and brief clarification.</w:t>
+              <w:t>28 minutes 30 seconds, leaving time for pauses and brief clarification.</w:t>
             </w:r>
           </w:p>
         </w:tc>
@@ -3503,7 +3701,7 @@
         <w:pStyle w:val="Heading2"/>
       </w:pPr>
       <w:r>
-        <w:t>Slide 17: Working Application Evidence</w:t>
+        <w:t>Slide 17: Application Evidence: Admin Dashboard</w:t>
       </w:r>
     </w:p>
     <w:p>
@@ -3518,7 +3716,7 @@
         <w:t xml:space="preserve">Time: </w:t>
       </w:r>
       <w:r>
-        <w:t>65 seconds</w:t>
+        <w:t>30 seconds</w:t>
       </w:r>
     </w:p>
     <w:p>
@@ -3533,7 +3731,7 @@
         <w:t xml:space="preserve">Key message: </w:t>
       </w:r>
       <w:r>
-        <w:t>The screenshots demonstrate the user-visible path through authentication, reporting, audit, and role restrictions.</w:t>
+        <w:t>The client exposes live API state, authenticated roles, and research evidence in one operational view.</w:t>
       </w:r>
     </w:p>
     <w:p>
@@ -3546,7 +3744,7 @@
     </w:p>
     <w:p>
       <w:r>
-        <w:t>The React and Vite client is a validation artifact for the API. It demonstrates login, role-aware navigation, account balances, financial reports, audit logs, and expandable journal-entry debit and credit lines. The Auditor screenshot is particularly useful because it shows restricted navigation and read-only account access. These screenshots support the claim that the API behavior is accessible through a real client. They do not replace the tool measurements or regression tests; they complement them with user-visible evidence.</w:t>
+        <w:t>This dashboard is a live client view rather than a static mock-up. It shows the authenticated Admin and FinanceManager roles, loaded accounts and periods, the trial-balance total, and the API coverage evidence used for the demonstration. The screenshot supports user-visible integration, but it does not replace scanner or regression-test evidence.</w:t>
       </w:r>
     </w:p>
     <w:p>
@@ -3561,7 +3759,7 @@
         <w:t xml:space="preserve">Transition: </w:t>
       </w:r>
       <w:r>
-        <w:t>These completed Codex 5.4 results now lead to the thesis contributions and limitations.</w:t>
+        <w:t>The same client calls the reporting API and renders the calculated trial balance.</w:t>
       </w:r>
     </w:p>
     <w:p>
@@ -3591,7 +3789,7 @@
         <w:t xml:space="preserve">Evidence: </w:t>
       </w:r>
       <w:r>
-        <w:t>Section 4.6 and Figures 4.1-4.7, pp. 51-58</w:t>
+        <w:t>Section 4.6 and Figure 4.2, pp. 51-53</w:t>
       </w:r>
     </w:p>
     <w:p>
@@ -3604,7 +3802,7 @@
         <w:pStyle w:val="Heading2"/>
       </w:pPr>
       <w:r>
-        <w:t>Slide 18: Contributions</w:t>
+        <w:t>Slide 18: Application Evidence: Trial Balance</w:t>
       </w:r>
     </w:p>
     <w:p>
@@ -3619,7 +3817,7 @@
         <w:t xml:space="preserve">Time: </w:t>
       </w:r>
       <w:r>
-        <w:t>75 seconds</w:t>
+        <w:t>30 seconds</w:t>
       </w:r>
     </w:p>
     <w:p>
@@ -3634,7 +3832,7 @@
         <w:t xml:space="preserve">Key message: </w:t>
       </w:r>
       <w:r>
-        <w:t>The Codex 5.4 thesis contributes measured evidence, a reusable control workflow, and transparent limits on AI-assisted remediation.</w:t>
+        <w:t>The reports workspace shows balanced debit and credit totals returned by the financial-reporting API.</w:t>
       </w:r>
     </w:p>
     <w:p>
@@ -3647,7 +3845,7 @@
     </w:p>
     <w:p>
       <w:r>
-        <w:t>The core Codex 5.4 thesis makes three contributions. Empirically, it provides measured before-and-after evidence across static quality, security scanning, and load testing on one production-complexity accounting API. Methodologically, it defines a reusable branch-isolated, scanner-gated workflow for accepting or rejecting model recommendations. Practically, it preserves traceability from finding to prompt, candidate patch, human decision, focused test, and rerun. The thesis does not claim a new algorithm, autonomous remediation, or a universal model ranking.</w:t>
+        <w:t>The reports workspace calls the current reporting API for period 202601. The visible totals show equal debit and credit values of 8,480,875 dollars and 73 cents, followed by account-level debit, credit, and balance columns. This is user-visible evidence of the reporting path, while the accounting tests remain the stronger correctness control.</w:t>
       </w:r>
     </w:p>
     <w:p>
@@ -3662,7 +3860,7 @@
         <w:t xml:space="preserve">Transition: </w:t>
       </w:r>
       <w:r>
-        <w:t>The value of those contributions depends on keeping the study limitations visible.</w:t>
+        <w:t>The next view demonstrates that navigation and actions change with the authenticated role.</w:t>
       </w:r>
     </w:p>
     <w:p>
@@ -3677,7 +3875,7 @@
         <w:t xml:space="preserve">Do not overclaim: </w:t>
       </w:r>
       <w:r>
-        <w:t>Do not describe a single-system Codex 5.4 case study as broad statistical proof.</w:t>
+        <w:t>Do not claim that one screenshot proves every report calculation is correct.</w:t>
       </w:r>
     </w:p>
     <w:p>
@@ -3692,7 +3890,7 @@
         <w:t xml:space="preserve">Evidence: </w:t>
       </w:r>
       <w:r>
-        <w:t>Section 5.3, p. 63 | Sections 3.1.3-3.1.4, p. 37</w:t>
+        <w:t>Section 4.6 and Figure 4.3, pp. 53-54</w:t>
       </w:r>
     </w:p>
     <w:p>
@@ -3705,7 +3903,7 @@
         <w:pStyle w:val="Heading2"/>
       </w:pPr>
       <w:r>
-        <w:t>Slide 19: Limitations and Future Work</w:t>
+        <w:t>Slide 19: Application Evidence: Auditor Restrictions</w:t>
       </w:r>
     </w:p>
     <w:p>
@@ -3720,7 +3918,7 @@
         <w:t xml:space="preserve">Time: </w:t>
       </w:r>
       <w:r>
-        <w:t>80 seconds</w:t>
+        <w:t>30 seconds</w:t>
       </w:r>
     </w:p>
     <w:p>
@@ -3735,7 +3933,7 @@
         <w:t xml:space="preserve">Key message: </w:t>
       </w:r>
       <w:r>
-        <w:t>The Codex 5.4 workflow is reproducible, but external validity, stochastic variance, tool limits, and drift measurement remain open.</w:t>
+        <w:t>The Auditor role receives read-only account access and a restricted navigation surface.</w:t>
       </w:r>
     </w:p>
     <w:p>
@@ -3748,7 +3946,7 @@
     </w:p>
     <w:p>
       <w:r>
-        <w:t>The Codex 5.4 study has important limitations. It evaluates one C# API, one database-backed financial domain, one local host, and one primary model. Repeated stochastic runs were not performed, so output variance is unknown. SonarQube, ZAP, and JMeter each have detection limits and cannot replace manual security review or production observability. The mixed-workload drift rule also confounds request composition with time-based degradation. Future work should replicate the method across systems, repeat prompts, improve the drift measurement, and compare newer models without changing the original Codex 5.4 conclusion.</w:t>
+        <w:t>This view is authenticated as an Auditor. The navigation excludes user and journal-maintenance functions, and the account page explicitly states that maintenance is restricted for this role. The remaining action is to view balances. This complements, but does not replace, endpoint-level authorization tests.</w:t>
       </w:r>
     </w:p>
     <w:p>
@@ -3763,7 +3961,7 @@
         <w:t xml:space="preserve">Transition: </w:t>
       </w:r>
       <w:r>
-        <w:t>I will now show two later measurements as future-work follow-ups, separate from the core thesis evidence.</w:t>
+        <w:t>The final application view exposes the balanced debit and credit lines behind a journal entry.</w:t>
       </w:r>
     </w:p>
     <w:p>
@@ -3778,7 +3976,7 @@
         <w:t xml:space="preserve">Do not overclaim: </w:t>
       </w:r>
       <w:r>
-        <w:t>Keep the original thesis conclusion limited to the Codex 5.4 study.</w:t>
+        <w:t>Describe this as visible role behavior, not exhaustive authorization proof.</w:t>
       </w:r>
     </w:p>
     <w:p>
@@ -3793,7 +3991,7 @@
         <w:t xml:space="preserve">Evidence: </w:t>
       </w:r>
       <w:r>
-        <w:t>Camera-ready Threats to Validity | Section 5.4, p. 63</w:t>
+        <w:t>Section 4.6 and Figure 4.5, pp. 55-56</w:t>
       </w:r>
     </w:p>
     <w:p>
@@ -3806,7 +4004,7 @@
         <w:pStyle w:val="Heading2"/>
       </w:pPr>
       <w:r>
-        <w:t>Slide 20: Future Work Follow-Up: GPT-5.4 vs GPT-5.5</w:t>
+        <w:t>Slide 20: Application Evidence: Balanced Journal Lines</w:t>
       </w:r>
     </w:p>
     <w:p>
@@ -3821,7 +4019,7 @@
         <w:t xml:space="preserve">Time: </w:t>
       </w:r>
       <w:r>
-        <w:t>100 seconds</w:t>
+        <w:t>30 seconds</w:t>
       </w:r>
     </w:p>
     <w:p>
@@ -3836,7 +4034,7 @@
         <w:t xml:space="preserve">Key message: </w:t>
       </w:r>
       <w:r>
-        <w:t>The later comparison is a future-work extension: SonarQube ties, residual ZAP cleanliness favors GPT-5.4, and balanced JMeter behavior favors GPT-5.5.</w:t>
+        <w:t>Expanded journal details make the matching debit and credit lines visible in the client.</w:t>
       </w:r>
     </w:p>
     <w:p>
@@ -3849,7 +4047,7 @@
     </w:p>
     <w:p>
       <w:r>
-        <w:t>This slide is not part of the original camera-ready study or its primary thesis conclusion. It shows a later future-work follow-up using GPT-5.5. The normalized comparison does not support a universal winner. Both models reached zero SonarQube code smells and 74.3 percent coverage. GPT-5.4 produced cleaner residual ZAP output. GPT-5.5 produced the more balanced JMeter profile and used smaller ZAP and JMeter patches. These results demonstrate how the branch-isolated workflow can support future multi-model research; they do not change the original Codex 5.4 findings.</w:t>
+        <w:t>The expanded journal entry shows equal debit and credit totals of 690 dollars and 82 cents. The two lines allocate that amount as a debit to Cash and a credit to Accounts Payable. This makes the balanced-entry behavior visible to the reviewer while the API validation and regression tests enforce the invariant.</w:t>
       </w:r>
     </w:p>
     <w:p>
@@ -3864,7 +4062,7 @@
         <w:t xml:space="preserve">Transition: </w:t>
       </w:r>
       <w:r>
-        <w:t>A second future-work follow-up tested a more complex API challenge, but one comparison track remains incomplete.</w:t>
+        <w:t>These completed Codex 5.4 results now lead to the thesis contributions and limitations.</w:t>
       </w:r>
     </w:p>
     <w:p>
@@ -3879,7 +4077,7 @@
         <w:t xml:space="preserve">Do not overclaim: </w:t>
       </w:r>
       <w:r>
-        <w:t>Describe GPT-5.5 only as supplemental future-work evidence, never as the primary thesis model.</w:t>
+        <w:t>Do not infer system-wide accounting correctness from one displayed entry.</w:t>
       </w:r>
     </w:p>
     <w:p>
@@ -3894,7 +4092,7 @@
         <w:t xml:space="preserve">Evidence: </w:t>
       </w:r>
       <w:r>
-        <w:t>Later full-report extension, Tables 4.7-4.11, pp. 59-60</w:t>
+        <w:t>Section 4.6 and Figure 4.7, pp. 57-58</w:t>
       </w:r>
     </w:p>
     <w:p>
@@ -3907,7 +4105,7 @@
         <w:pStyle w:val="Heading2"/>
       </w:pPr>
       <w:r>
-        <w:t>Slide 21: Future Work Follow-Up: New-API v2</w:t>
+        <w:t>Slide 21: Contributions</w:t>
       </w:r>
     </w:p>
     <w:p>
@@ -3922,7 +4120,7 @@
         <w:t xml:space="preserve">Time: </w:t>
       </w:r>
       <w:r>
-        <w:t>100 seconds</w:t>
+        <w:t>75 seconds</w:t>
       </w:r>
     </w:p>
     <w:p>
@@ -3937,7 +4135,7 @@
         <w:t xml:space="preserve">Key message: </w:t>
       </w:r>
       <w:r>
-        <w:t>The later v2 follow-up ties on SonarQube and ZAP, but the GPT-5.4 JMeter track is incomplete and no overall winner is recorded.</w:t>
+        <w:t>The Codex 5.4 thesis contributes measured evidence, a reusable control workflow, and transparent limits on AI-assisted remediation.</w:t>
       </w:r>
     </w:p>
     <w:p>
@@ -3950,7 +4148,7 @@
     </w:p>
     <w:p>
       <w:r>
-        <w:t>This is also supplemental future-work evidence rather than a core thesis result. The v2 retest gave both Sonar candidates the same scan, correction, and rescan opportunity. Both reached zero measured Sonar issues, and both ZAP candidates ended with 12 verified alert instances. Their later public suites passed 152 and 151 tests respectively. However, no valid GPT-5.4 JMeter remediation candidate exists for this v2 track. Therefore, the follow-up records SonarQube and ZAP ties but does not declare an overall three-tool winner.</w:t>
+        <w:t>The core Codex 5.4 thesis makes three contributions. Empirically, it provides measured before-and-after evidence across static quality, security scanning, and load testing on one production-complexity accounting API. Methodologically, it defines a reusable branch-isolated, scanner-gated workflow for accepting or rejecting model recommendations. Practically, it preserves traceability from finding to prompt, candidate patch, human decision, focused test, and rerun. The thesis does not claim a new algorithm, autonomous remediation, or a universal model ranking.</w:t>
       </w:r>
     </w:p>
     <w:p>
@@ -3965,7 +4163,7 @@
         <w:t xml:space="preserve">Transition: </w:t>
       </w:r>
       <w:r>
-        <w:t>I will now return to the original Codex 5.4 thesis conclusion.</w:t>
+        <w:t>The value of those contributions depends on keeping the study limitations visible.</w:t>
       </w:r>
     </w:p>
     <w:p>
@@ -3980,7 +4178,7 @@
         <w:t xml:space="preserve">Do not overclaim: </w:t>
       </w:r>
       <w:r>
-        <w:t>Do not mix the v2 test counts or partial model comparison into the original 98-test Codex 5.4 study.</w:t>
+        <w:t>Do not describe a single-system Codex 5.4 case study as broad statistical proof.</w:t>
       </w:r>
     </w:p>
     <w:p>
@@ -3995,7 +4193,7 @@
         <w:t xml:space="preserve">Evidence: </w:t>
       </w:r>
       <w:r>
-        <w:t>Later full-report extension, Table 4.12, pp. 61-62</w:t>
+        <w:t>Section 5.3, p. 63 | Sections 3.1.3-3.1.4, p. 37</w:t>
       </w:r>
     </w:p>
     <w:p>
@@ -4008,7 +4206,7 @@
         <w:pStyle w:val="Heading2"/>
       </w:pPr>
       <w:r>
-        <w:t>Slide 22: Conclusion</w:t>
+        <w:t>Slide 22: Limitations and Future Work</w:t>
       </w:r>
     </w:p>
     <w:p>
@@ -4023,7 +4221,7 @@
         <w:t xml:space="preserve">Time: </w:t>
       </w:r>
       <w:r>
-        <w:t>55 seconds</w:t>
+        <w:t>80 seconds</w:t>
       </w:r>
     </w:p>
     <w:p>
@@ -4038,7 +4236,7 @@
         <w:t xml:space="preserve">Key message: </w:t>
       </w:r>
       <w:r>
-        <w:t>AI-assisted remediation is useful when evidence and human controls decide what ships.</w:t>
+        <w:t>The Codex 5.4 workflow is reproducible, but external validity, stochastic variance, tool limits, and drift measurement remain open.</w:t>
       </w:r>
     </w:p>
     <w:p>
@@ -4051,7 +4249,7 @@
     </w:p>
     <w:p>
       <w:r>
-        <w:t>In conclusion, the core Codex 5.4 study shows that ChatGPT can be useful as a remediation advisor when it operates inside a controlled engineering process. The study reduced the measured SonarQube finding set from 28 to zero, cleared gated business-endpoint ZAP alerts, and achieved large p95 latency reductions while preserving the documented drift limitation. Human review, focused tests, branch isolation, and independent remeasurement make these findings defensible. The future-work slides do not change this primary conclusion. The central lesson is simple: use the model to propose, but use evidence to decide. Thank you. I welcome your questions.</w:t>
+        <w:t>The Codex 5.4 study has important limitations. It evaluates one C# API, one database-backed financial domain, one local host, and one primary model. Repeated stochastic runs were not performed, so output variance is unknown. SonarQube, ZAP, and JMeter each have detection limits and cannot replace manual security review or production observability. The mixed-workload drift rule also confounds request composition with time-based degradation. Future work should replicate the method across systems, repeat prompts, improve the drift measurement, and compare newer models without changing the original Codex 5.4 conclusion.</w:t>
       </w:r>
     </w:p>
     <w:p>
@@ -4066,7 +4264,7 @@
         <w:t xml:space="preserve">Transition: </w:t>
       </w:r>
       <w:r>
-        <w:t>Open the appendix only when a question requires detailed evidence.</w:t>
+        <w:t>I will now show two later measurements as future-work follow-ups, separate from the core thesis evidence.</w:t>
       </w:r>
     </w:p>
     <w:p>
@@ -4081,7 +4279,7 @@
         <w:t xml:space="preserve">Do not overclaim: </w:t>
       </w:r>
       <w:r>
-        <w:t>End after the final sentence; do not continue summarizing.</w:t>
+        <w:t>Keep the original thesis conclusion limited to the Codex 5.4 study.</w:t>
       </w:r>
     </w:p>
     <w:p>
@@ -4096,6 +4294,309 @@
         <w:t xml:space="preserve">Evidence: </w:t>
       </w:r>
       <w:r>
+        <w:t>Camera-ready Threats to Validity | Section 5.4, p. 63</w:t>
+      </w:r>
+    </w:p>
+    <w:p>
+      <w:r>
+        <w:br w:type="page"/>
+      </w:r>
+    </w:p>
+    <w:p>
+      <w:pPr>
+        <w:pStyle w:val="Heading2"/>
+      </w:pPr>
+      <w:r>
+        <w:t>Slide 23: Future Work Follow-Up: GPT-5.4 vs GPT-5.5</w:t>
+      </w:r>
+    </w:p>
+    <w:p>
+      <w:pPr>
+        <w:spacing w:after="80"/>
+      </w:pPr>
+      <w:r>
+        <w:rPr>
+          <w:b/>
+          <w:color w:val="C47B12"/>
+        </w:rPr>
+        <w:t xml:space="preserve">Time: </w:t>
+      </w:r>
+      <w:r>
+        <w:t>100 seconds</w:t>
+      </w:r>
+    </w:p>
+    <w:p>
+      <w:pPr>
+        <w:spacing w:after="80"/>
+      </w:pPr>
+      <w:r>
+        <w:rPr>
+          <w:b/>
+          <w:color w:val="2F7D4A"/>
+        </w:rPr>
+        <w:t xml:space="preserve">Key message: </w:t>
+      </w:r>
+      <w:r>
+        <w:t>The later comparison is a future-work extension: SonarQube ties, residual ZAP cleanliness favors GPT-5.4, and balanced JMeter behavior favors GPT-5.5.</w:t>
+      </w:r>
+    </w:p>
+    <w:p>
+      <w:pPr>
+        <w:pStyle w:val="Heading3"/>
+      </w:pPr>
+      <w:r>
+        <w:t>What to say</w:t>
+      </w:r>
+    </w:p>
+    <w:p>
+      <w:r>
+        <w:t>This slide is not part of the original camera-ready study or its primary thesis conclusion. It shows a later future-work follow-up using GPT-5.5. The normalized comparison does not support a universal winner. Both models reached zero SonarQube code smells and 74.3 percent coverage. GPT-5.4 produced cleaner residual ZAP output. GPT-5.5 produced the more balanced JMeter profile and used smaller ZAP and JMeter patches. These results demonstrate how the branch-isolated workflow can support future multi-model research; they do not change the original Codex 5.4 findings.</w:t>
+      </w:r>
+    </w:p>
+    <w:p>
+      <w:pPr>
+        <w:spacing w:after="80"/>
+      </w:pPr>
+      <w:r>
+        <w:rPr>
+          <w:b/>
+          <w:color w:val="0B6670"/>
+        </w:rPr>
+        <w:t xml:space="preserve">Transition: </w:t>
+      </w:r>
+      <w:r>
+        <w:t>A second future-work follow-up tested a more complex API challenge, but one comparison track remains incomplete.</w:t>
+      </w:r>
+    </w:p>
+    <w:p>
+      <w:pPr>
+        <w:spacing w:after="80"/>
+      </w:pPr>
+      <w:r>
+        <w:rPr>
+          <w:b/>
+          <w:color w:val="B93A3A"/>
+        </w:rPr>
+        <w:t xml:space="preserve">Do not overclaim: </w:t>
+      </w:r>
+      <w:r>
+        <w:t>Describe GPT-5.5 only as supplemental future-work evidence, never as the primary thesis model.</w:t>
+      </w:r>
+    </w:p>
+    <w:p>
+      <w:pPr>
+        <w:spacing w:after="80"/>
+      </w:pPr>
+      <w:r>
+        <w:rPr>
+          <w:b/>
+          <w:color w:val="66717E"/>
+        </w:rPr>
+        <w:t xml:space="preserve">Evidence: </w:t>
+      </w:r>
+      <w:r>
+        <w:t>Later full-report extension, Tables 4.7-4.11, pp. 59-60</w:t>
+      </w:r>
+    </w:p>
+    <w:p>
+      <w:r>
+        <w:br w:type="page"/>
+      </w:r>
+    </w:p>
+    <w:p>
+      <w:pPr>
+        <w:pStyle w:val="Heading2"/>
+      </w:pPr>
+      <w:r>
+        <w:t>Slide 24: Future Work Follow-Up: New-API v2</w:t>
+      </w:r>
+    </w:p>
+    <w:p>
+      <w:pPr>
+        <w:spacing w:after="80"/>
+      </w:pPr>
+      <w:r>
+        <w:rPr>
+          <w:b/>
+          <w:color w:val="C47B12"/>
+        </w:rPr>
+        <w:t xml:space="preserve">Time: </w:t>
+      </w:r>
+      <w:r>
+        <w:t>100 seconds</w:t>
+      </w:r>
+    </w:p>
+    <w:p>
+      <w:pPr>
+        <w:spacing w:after="80"/>
+      </w:pPr>
+      <w:r>
+        <w:rPr>
+          <w:b/>
+          <w:color w:val="2F7D4A"/>
+        </w:rPr>
+        <w:t xml:space="preserve">Key message: </w:t>
+      </w:r>
+      <w:r>
+        <w:t>The later v2 follow-up ties on SonarQube and ZAP, but the GPT-5.4 JMeter track is incomplete and no overall winner is recorded.</w:t>
+      </w:r>
+    </w:p>
+    <w:p>
+      <w:pPr>
+        <w:pStyle w:val="Heading3"/>
+      </w:pPr>
+      <w:r>
+        <w:t>What to say</w:t>
+      </w:r>
+    </w:p>
+    <w:p>
+      <w:r>
+        <w:t>This is also supplemental future-work evidence rather than a core thesis result. The v2 retest gave both Sonar candidates the same scan, correction, and rescan opportunity. Both reached zero measured Sonar issues, and both ZAP candidates ended with 12 verified alert instances. Their later public suites passed 152 and 151 tests respectively. However, no valid GPT-5.4 JMeter remediation candidate exists for this v2 track. Therefore, the follow-up records SonarQube and ZAP ties but does not declare an overall three-tool winner.</w:t>
+      </w:r>
+    </w:p>
+    <w:p>
+      <w:pPr>
+        <w:spacing w:after="80"/>
+      </w:pPr>
+      <w:r>
+        <w:rPr>
+          <w:b/>
+          <w:color w:val="0B6670"/>
+        </w:rPr>
+        <w:t xml:space="preserve">Transition: </w:t>
+      </w:r>
+      <w:r>
+        <w:t>I will now return to the original Codex 5.4 thesis conclusion.</w:t>
+      </w:r>
+    </w:p>
+    <w:p>
+      <w:pPr>
+        <w:spacing w:after="80"/>
+      </w:pPr>
+      <w:r>
+        <w:rPr>
+          <w:b/>
+          <w:color w:val="B93A3A"/>
+        </w:rPr>
+        <w:t xml:space="preserve">Do not overclaim: </w:t>
+      </w:r>
+      <w:r>
+        <w:t>Do not mix the v2 test counts or partial model comparison into the original 98-test Codex 5.4 study.</w:t>
+      </w:r>
+    </w:p>
+    <w:p>
+      <w:pPr>
+        <w:spacing w:after="80"/>
+      </w:pPr>
+      <w:r>
+        <w:rPr>
+          <w:b/>
+          <w:color w:val="66717E"/>
+        </w:rPr>
+        <w:t xml:space="preserve">Evidence: </w:t>
+      </w:r>
+      <w:r>
+        <w:t>Later full-report extension, Table 4.12, pp. 61-62</w:t>
+      </w:r>
+    </w:p>
+    <w:p>
+      <w:r>
+        <w:br w:type="page"/>
+      </w:r>
+    </w:p>
+    <w:p>
+      <w:pPr>
+        <w:pStyle w:val="Heading2"/>
+      </w:pPr>
+      <w:r>
+        <w:t>Slide 25: Conclusion</w:t>
+      </w:r>
+    </w:p>
+    <w:p>
+      <w:pPr>
+        <w:spacing w:after="80"/>
+      </w:pPr>
+      <w:r>
+        <w:rPr>
+          <w:b/>
+          <w:color w:val="C47B12"/>
+        </w:rPr>
+        <w:t xml:space="preserve">Time: </w:t>
+      </w:r>
+      <w:r>
+        <w:t>55 seconds</w:t>
+      </w:r>
+    </w:p>
+    <w:p>
+      <w:pPr>
+        <w:spacing w:after="80"/>
+      </w:pPr>
+      <w:r>
+        <w:rPr>
+          <w:b/>
+          <w:color w:val="2F7D4A"/>
+        </w:rPr>
+        <w:t xml:space="preserve">Key message: </w:t>
+      </w:r>
+      <w:r>
+        <w:t>AI-assisted remediation is useful when evidence and human controls decide what ships.</w:t>
+      </w:r>
+    </w:p>
+    <w:p>
+      <w:pPr>
+        <w:pStyle w:val="Heading3"/>
+      </w:pPr>
+      <w:r>
+        <w:t>What to say</w:t>
+      </w:r>
+    </w:p>
+    <w:p>
+      <w:r>
+        <w:t>In conclusion, the core Codex 5.4 study shows that ChatGPT can be useful as a remediation advisor when it operates inside a controlled engineering process. The study reduced the measured SonarQube finding set from 28 to zero, cleared gated business-endpoint ZAP alerts, and achieved large p95 latency reductions while preserving the documented drift limitation. Human review, focused tests, branch isolation, and independent remeasurement make these findings defensible. The future-work slides do not change this primary conclusion. The central lesson is simple: use the model to propose, but use evidence to decide. Thank you. I welcome your questions.</w:t>
+      </w:r>
+    </w:p>
+    <w:p>
+      <w:pPr>
+        <w:spacing w:after="80"/>
+      </w:pPr>
+      <w:r>
+        <w:rPr>
+          <w:b/>
+          <w:color w:val="0B6670"/>
+        </w:rPr>
+        <w:t xml:space="preserve">Transition: </w:t>
+      </w:r>
+      <w:r>
+        <w:t>Open the appendix only when a question requires detailed evidence.</w:t>
+      </w:r>
+    </w:p>
+    <w:p>
+      <w:pPr>
+        <w:spacing w:after="80"/>
+      </w:pPr>
+      <w:r>
+        <w:rPr>
+          <w:b/>
+          <w:color w:val="B93A3A"/>
+        </w:rPr>
+        <w:t xml:space="preserve">Do not overclaim: </w:t>
+      </w:r>
+      <w:r>
+        <w:t>End after the final sentence; do not continue summarizing.</w:t>
+      </w:r>
+    </w:p>
+    <w:p>
+      <w:pPr>
+        <w:spacing w:after="80"/>
+      </w:pPr>
+      <w:r>
+        <w:rPr>
+          <w:b/>
+          <w:color w:val="66717E"/>
+        </w:rPr>
+        <w:t xml:space="preserve">Evidence: </w:t>
+      </w:r>
+      <w:r>
         <w:t>Chapter 5, p. 63</w:t>
       </w:r>
     </w:p>
@@ -4183,7 +4684,7 @@
         <w:t xml:space="preserve">Supporting slide: </w:t>
       </w:r>
       <w:r>
-        <w:t>S18 and A09</w:t>
+        <w:t>S21 and A09</w:t>
       </w:r>
     </w:p>
     <w:p>
@@ -4335,7 +4836,7 @@
         <w:t xml:space="preserve">Supporting slide: </w:t>
       </w:r>
       <w:r>
-        <w:t>S12-S15 and S22</w:t>
+        <w:t>S12-S15 and S25</w:t>
       </w:r>
     </w:p>
     <w:p>
@@ -4411,7 +4912,7 @@
         <w:t xml:space="preserve">Supporting slide: </w:t>
       </w:r>
       <w:r>
-        <w:t>S20-S21</w:t>
+        <w:t>S23-S24</w:t>
       </w:r>
     </w:p>
     <w:p>
@@ -4563,7 +5064,7 @@
         <w:t xml:space="preserve">Supporting slide: </w:t>
       </w:r>
       <w:r>
-        <w:t>S04-S10 and S20-S21</w:t>
+        <w:t>S04-S10 and S23-S24</w:t>
       </w:r>
     </w:p>
     <w:p>
@@ -4729,7 +5230,7 @@
         <w:t xml:space="preserve">Supporting slide: </w:t>
       </w:r>
       <w:r>
-        <w:t>S06 and S19</w:t>
+        <w:t>S06 and S22</w:t>
       </w:r>
     </w:p>
     <w:p>
@@ -4805,7 +5306,7 @@
         <w:t xml:space="preserve">Supporting slide: </w:t>
       </w:r>
       <w:r>
-        <w:t>S19 and A08</w:t>
+        <w:t>S22 and A08</w:t>
       </w:r>
     </w:p>
     <w:p>
@@ -5199,7 +5700,7 @@
         <w:t xml:space="preserve">Supporting slide: </w:t>
       </w:r>
       <w:r>
-        <w:t>S13 and S20</w:t>
+        <w:t>S13 and S23</w:t>
       </w:r>
     </w:p>
     <w:p>
@@ -5275,7 +5776,7 @@
         <w:t xml:space="preserve">Supporting slide: </w:t>
       </w:r>
       <w:r>
-        <w:t>S16-S17 and A02</w:t>
+        <w:t>S16-S20 and A02</w:t>
       </w:r>
     </w:p>
     <w:p>
@@ -5821,7 +6322,7 @@
         <w:t xml:space="preserve">Supporting slide: </w:t>
       </w:r>
       <w:r>
-        <w:t>S15 and S19</w:t>
+        <w:t>S15 and S22</w:t>
       </w:r>
     </w:p>
     <w:p>
@@ -6063,7 +6564,7 @@
         <w:t xml:space="preserve">Supporting slide: </w:t>
       </w:r>
       <w:r>
-        <w:t>S18-S19</w:t>
+        <w:t>S21-S22</w:t>
       </w:r>
     </w:p>
     <w:p>
@@ -6215,7 +6716,7 @@
         <w:t xml:space="preserve">Supporting slide: </w:t>
       </w:r>
       <w:r>
-        <w:t>S20-S21 and A01</w:t>
+        <w:t>S23-S24 and A01</w:t>
       </w:r>
     </w:p>
     <w:p>
@@ -6291,7 +6792,7 @@
         <w:t xml:space="preserve">Supporting slide: </w:t>
       </w:r>
       <w:r>
-        <w:t>S20 and A04</w:t>
+        <w:t>S23 and A04</w:t>
       </w:r>
     </w:p>
     <w:p>
@@ -6367,7 +6868,7 @@
         <w:t xml:space="preserve">Supporting slide: </w:t>
       </w:r>
       <w:r>
-        <w:t>S21 and A07</w:t>
+        <w:t>S24 and A07</w:t>
       </w:r>
     </w:p>
     <w:p>
@@ -6443,7 +6944,7 @@
         <w:t xml:space="preserve">Supporting slide: </w:t>
       </w:r>
       <w:r>
-        <w:t>S19 and S22</w:t>
+        <w:t>S22 and S25</w:t>
       </w:r>
     </w:p>
     <w:p>
@@ -6498,7 +6999,7 @@
     </w:p>
     <w:p>
       <w:r>
-        <w:t>Finish the main deck in 27-28 minutes and shorten only notes, not evidence.</w:t>
+        <w:t>Finish the main deck in 28-29 minutes and shorten only notes, not evidence.</w:t>
       </w:r>
     </w:p>
     <w:p>

</xml_diff>